<commit_message>
Líneas en solicitudes y en su ficha, catálogos del equipo con llave foránea (SPEC 2.160-2.168)
</commit_message>
<xml_diff>
--- a/documentacion/Arquitectura_general.docx
+++ b/documentacion/Arquitectura_general.docx
@@ -448,7 +448,7 @@
     <w:sdt>
       <w:sdtPr>
         <w:alias w:val="Contenido"/>
-        <w:id w:val="132998717"/>
+        <w:id w:val="564453673"/>
       </w:sdtPr>
       <w:sdtEndPr/>
       <w:sdtContent>
@@ -477,7 +477,7 @@
           <w:r>
             <w:fldChar w:fldCharType="separate"/>
           </w:r>
-          <w:hyperlink w:anchor="_Toc242791789" w:history="1">
+          <w:hyperlink w:anchor="_Toc243055154" w:history="1">
             <w:r>
               <w:rPr>
                 <w:rStyle w:val="Hipervnculo"/>
@@ -501,7 +501,7 @@
               <w:rPr>
                 <w:noProof/>
               </w:rPr>
-              <w:instrText xml:space="preserve"> PAGEREF _Toc242791789 \h </w:instrText>
+              <w:instrText xml:space="preserve"> PAGEREF _Toc243055154 \h </w:instrText>
             </w:r>
             <w:r>
               <w:rPr>
@@ -544,7 +544,7 @@
               <w14:ligatures w14:val="standardContextual"/>
             </w:rPr>
           </w:pPr>
-          <w:hyperlink w:anchor="_Toc242791790" w:history="1">
+          <w:hyperlink w:anchor="_Toc243055155" w:history="1">
             <w:r>
               <w:rPr>
                 <w:rStyle w:val="Hipervnculo"/>
@@ -568,7 +568,7 @@
               <w:rPr>
                 <w:noProof/>
               </w:rPr>
-              <w:instrText xml:space="preserve"> PAGEREF _Toc242791790 \h </w:instrText>
+              <w:instrText xml:space="preserve"> PAGEREF _Toc243055155 \h </w:instrText>
             </w:r>
             <w:r>
               <w:rPr>
@@ -611,7 +611,7 @@
               <w14:ligatures w14:val="standardContextual"/>
             </w:rPr>
           </w:pPr>
-          <w:hyperlink w:anchor="_Toc242791791" w:history="1">
+          <w:hyperlink w:anchor="_Toc243055156" w:history="1">
             <w:r>
               <w:rPr>
                 <w:rStyle w:val="Hipervnculo"/>
@@ -635,7 +635,7 @@
               <w:rPr>
                 <w:noProof/>
               </w:rPr>
-              <w:instrText xml:space="preserve"> PAGEREF _Toc242791791 \h </w:instrText>
+              <w:instrText xml:space="preserve"> PAGEREF _Toc243055156 \h </w:instrText>
             </w:r>
             <w:r>
               <w:rPr>
@@ -678,7 +678,7 @@
               <w14:ligatures w14:val="standardContextual"/>
             </w:rPr>
           </w:pPr>
-          <w:hyperlink w:anchor="_Toc242791792" w:history="1">
+          <w:hyperlink w:anchor="_Toc243055157" w:history="1">
             <w:r>
               <w:rPr>
                 <w:rStyle w:val="Hipervnculo"/>
@@ -702,7 +702,7 @@
               <w:rPr>
                 <w:noProof/>
               </w:rPr>
-              <w:instrText xml:space="preserve"> PAGEREF _Toc242791792 \h </w:instrText>
+              <w:instrText xml:space="preserve"> PAGEREF _Toc243055157 \h </w:instrText>
             </w:r>
             <w:r>
               <w:rPr>
@@ -745,7 +745,7 @@
               <w14:ligatures w14:val="standardContextual"/>
             </w:rPr>
           </w:pPr>
-          <w:hyperlink w:anchor="_Toc242791793" w:history="1">
+          <w:hyperlink w:anchor="_Toc243055158" w:history="1">
             <w:r>
               <w:rPr>
                 <w:rStyle w:val="Hipervnculo"/>
@@ -769,7 +769,7 @@
               <w:rPr>
                 <w:noProof/>
               </w:rPr>
-              <w:instrText xml:space="preserve"> PAGEREF _Toc242791793 \h </w:instrText>
+              <w:instrText xml:space="preserve"> PAGEREF _Toc243055158 \h </w:instrText>
             </w:r>
             <w:r>
               <w:rPr>
@@ -812,7 +812,7 @@
               <w14:ligatures w14:val="standardContextual"/>
             </w:rPr>
           </w:pPr>
-          <w:hyperlink w:anchor="_Toc242791794" w:history="1">
+          <w:hyperlink w:anchor="_Toc243055159" w:history="1">
             <w:r>
               <w:rPr>
                 <w:rStyle w:val="Hipervnculo"/>
@@ -836,7 +836,7 @@
               <w:rPr>
                 <w:noProof/>
               </w:rPr>
-              <w:instrText xml:space="preserve"> PAGEREF _Toc242791794 \h </w:instrText>
+              <w:instrText xml:space="preserve"> PAGEREF _Toc243055159 \h </w:instrText>
             </w:r>
             <w:r>
               <w:rPr>
@@ -880,7 +880,7 @@
         <w:pStyle w:val="Ttulo1"/>
         <w:keepNext/>
       </w:pPr>
-      <w:bookmarkStart w:id="0" w:name="_Toc242791789"/>
+      <w:bookmarkStart w:id="0" w:name="_Toc243055154"/>
       <w:r>
         <w:t>1. Visión general</w:t>
       </w:r>
@@ -927,7 +927,7 @@
         <w:pStyle w:val="Ttulo1"/>
         <w:keepNext/>
       </w:pPr>
-      <w:bookmarkStart w:id="1" w:name="_Toc242791790"/>
+      <w:bookmarkStart w:id="1" w:name="_Toc243055155"/>
       <w:r>
         <w:t>2. Capas</w:t>
       </w:r>
@@ -1797,7 +1797,7 @@
         <w:pStyle w:val="Ttulo1"/>
         <w:keepNext/>
       </w:pPr>
-      <w:bookmarkStart w:id="2" w:name="_Toc242791791"/>
+      <w:bookmarkStart w:id="2" w:name="_Toc243055156"/>
       <w:r>
         <w:t>3. Flujo de una petición</w:t>
       </w:r>
@@ -2153,7 +2153,7 @@
         <w:pStyle w:val="Ttulo1"/>
         <w:keepNext/>
       </w:pPr>
-      <w:bookmarkStart w:id="3" w:name="_Toc242791792"/>
+      <w:bookmarkStart w:id="3" w:name="_Toc243055157"/>
       <w:r>
         <w:t>4. Módulos de dominio</w:t>
       </w:r>
@@ -3062,7 +3062,7 @@
         <w:pStyle w:val="Ttulo1"/>
         <w:keepNext/>
       </w:pPr>
-      <w:bookmarkStart w:id="4" w:name="_Toc242791793"/>
+      <w:bookmarkStart w:id="4" w:name="_Toc243055158"/>
       <w:r>
         <w:t>5. Despliegue</w:t>
       </w:r>
@@ -3213,7 +3213,7 @@
         <w:pStyle w:val="Ttulo1"/>
         <w:keepNext/>
       </w:pPr>
-      <w:bookmarkStart w:id="5" w:name="_Toc242791794"/>
+      <w:bookmarkStart w:id="5" w:name="_Toc243055159"/>
       <w:r>
         <w:t>6. Atributos de calidad que guían la arquitectura</w:t>
       </w:r>
@@ -3865,221 +3865,221 @@
 <file path=word/numbering.xml><?xml version="1.0" encoding="utf-8"?>
 <w:numbering xmlns:wpc="http://schemas.microsoft.com/office/word/2010/wordprocessingCanvas" xmlns:cx="http://schemas.microsoft.com/office/drawing/2014/chartex" xmlns:cx1="http://schemas.microsoft.com/office/drawing/2015/9/8/chartex" xmlns:cx2="http://schemas.microsoft.com/office/drawing/2015/10/21/chartex" xmlns:cx3="http://schemas.microsoft.com/office/drawing/2016/5/9/chartex" xmlns:cx4="http://schemas.microsoft.com/office/drawing/2016/5/10/chartex" xmlns:cx5="http://schemas.microsoft.com/office/drawing/2016/5/11/chartex" xmlns:cx6="http://schemas.microsoft.com/office/drawing/2016/5/12/chartex" xmlns:cx7="http://schemas.microsoft.com/office/drawing/2016/5/13/chartex" xmlns:cx8="http://schemas.microsoft.com/office/drawing/2016/5/14/chartex" xmlns:mc="http://schemas.openxmlformats.org/markup-compatibility/2006" xmlns:aink="http://schemas.microsoft.com/office/drawing/2016/ink" xmlns:am3d="http://schemas.microsoft.com/office/drawing/2017/model3d" xmlns:o="urn:schemas-microsoft-com:office:office" xmlns:oel="http://schemas.microsoft.com/office/2019/extlst" xmlns:r="http://schemas.openxmlformats.org/officeDocument/2006/relationships" xmlns:m="http://schemas.openxmlformats.org/officeDocument/2006/math" xmlns:v="urn:schemas-microsoft-com:vml" xmlns:wp14="http://schemas.microsoft.com/office/word/2010/wordprocessingDrawing" xmlns:wp="http://schemas.openxmlformats.org/drawingml/2006/wordprocessingDrawing" xmlns:w10="urn:schemas-microsoft-com:office:word" xmlns:w="http://schemas.openxmlformats.org/wordprocessingml/2006/main" xmlns:w14="http://schemas.microsoft.com/office/word/2010/wordml" xmlns:w15="http://schemas.microsoft.com/office/word/2012/wordml" xmlns:w16cex="http://schemas.microsoft.com/office/word/2018/wordml/cex" xmlns:w16cid="http://schemas.microsoft.com/office/word/2016/wordml/cid" xmlns:w16="http://schemas.microsoft.com/office/word/2018/wordml" xmlns:w16du="http://schemas.microsoft.com/office/word/2023/wordml/word16du" xmlns:w16sdtdh="http://schemas.microsoft.com/office/word/2020/wordml/sdtdatahash" xmlns:w16sdtfl="http://schemas.microsoft.com/office/word/2024/wordml/sdtformatlock" xmlns:w16se="http://schemas.microsoft.com/office/word/2015/wordml/symex" xmlns:wpg="http://schemas.microsoft.com/office/word/2010/wordprocessingGroup" xmlns:wpi="http://schemas.microsoft.com/office/word/2010/wordprocessingInk" xmlns:wne="http://schemas.microsoft.com/office/word/2006/wordml" xmlns:wps="http://schemas.microsoft.com/office/word/2010/wordprocessingShape" mc:Ignorable="w14 w15 w16se w16cid w16 w16cex w16sdtdh w16sdtfl w16du wp14">
   <w:abstractNum w:abstractNumId="0" w15:restartNumberingAfterBreak="0">
-    <w:nsid w:val="047E0DA9"/>
+    <w:nsid w:val="1649207F"/>
     <w:multiLevelType w:val="hybridMultilevel"/>
-    <w:tmpl w:val="9376B734"/>
-    <w:lvl w:ilvl="0" w:tplc="C03C6270">
+    <w:tmpl w:val="C7E663DA"/>
+    <w:lvl w:ilvl="0" w:tplc="00DC3CE0">
       <w:start w:val="1"/>
-      <w:numFmt w:val="decimal"/>
-      <w:lvlText w:val="%1."/>
+      <w:numFmt w:val="bullet"/>
+      <w:lvlText w:val="•"/>
       <w:lvlJc w:val="left"/>
       <w:pPr>
-        <w:ind w:left="420" w:hanging="300"/>
+        <w:ind w:left="400" w:hanging="260"/>
       </w:pPr>
     </w:lvl>
-    <w:lvl w:ilvl="1" w:tplc="E9E0F704">
+    <w:lvl w:ilvl="1" w:tplc="D95C4B54" w:tentative="1">
+      <w:start w:val="1"/>
+      <w:numFmt w:val="bullet"/>
+      <w:lvlText w:val="–"/>
+      <w:lvlJc w:val="left"/>
+      <w:pPr>
+        <w:ind w:left="760" w:hanging="260"/>
+      </w:pPr>
+    </w:lvl>
+    <w:lvl w:ilvl="2" w:tplc="41DC0DBA" w:tentative="1">
+      <w:start w:val="1"/>
+      <w:numFmt w:val="bullet"/>
+      <w:lvlText w:val="·"/>
+      <w:lvlJc w:val="left"/>
+      <w:pPr>
+        <w:ind w:left="1120" w:hanging="260"/>
+      </w:pPr>
+    </w:lvl>
+    <w:lvl w:ilvl="3" w:tplc="F71478FA">
       <w:numFmt w:val="decimal"/>
       <w:lvlText w:val=""/>
       <w:lvlJc w:val="left"/>
     </w:lvl>
-    <w:lvl w:ilvl="2" w:tplc="0870135E">
+    <w:lvl w:ilvl="4" w:tplc="B38A246A">
       <w:numFmt w:val="decimal"/>
       <w:lvlText w:val=""/>
       <w:lvlJc w:val="left"/>
     </w:lvl>
-    <w:lvl w:ilvl="3" w:tplc="64F2F1BA">
+    <w:lvl w:ilvl="5" w:tplc="4FD0324A">
       <w:numFmt w:val="decimal"/>
       <w:lvlText w:val=""/>
       <w:lvlJc w:val="left"/>
     </w:lvl>
-    <w:lvl w:ilvl="4" w:tplc="32C2C6BA">
+    <w:lvl w:ilvl="6" w:tplc="B9126C6C">
       <w:numFmt w:val="decimal"/>
       <w:lvlText w:val=""/>
       <w:lvlJc w:val="left"/>
     </w:lvl>
-    <w:lvl w:ilvl="5" w:tplc="553C67F0">
+    <w:lvl w:ilvl="7" w:tplc="D2E89F5C">
       <w:numFmt w:val="decimal"/>
       <w:lvlText w:val=""/>
       <w:lvlJc w:val="left"/>
     </w:lvl>
-    <w:lvl w:ilvl="6" w:tplc="E35E1550">
-      <w:numFmt w:val="decimal"/>
-      <w:lvlText w:val=""/>
-      <w:lvlJc w:val="left"/>
-    </w:lvl>
-    <w:lvl w:ilvl="7" w:tplc="ED3A822A">
-      <w:numFmt w:val="decimal"/>
-      <w:lvlText w:val=""/>
-      <w:lvlJc w:val="left"/>
-    </w:lvl>
-    <w:lvl w:ilvl="8" w:tplc="F0B85528">
+    <w:lvl w:ilvl="8" w:tplc="05BAFAA8">
       <w:numFmt w:val="decimal"/>
       <w:lvlText w:val=""/>
       <w:lvlJc w:val="left"/>
     </w:lvl>
   </w:abstractNum>
   <w:abstractNum w:abstractNumId="1" w15:restartNumberingAfterBreak="0">
-    <w:nsid w:val="202442DA"/>
+    <w:nsid w:val="56AD606E"/>
     <w:multiLevelType w:val="hybridMultilevel"/>
-    <w:tmpl w:val="F172348A"/>
-    <w:lvl w:ilvl="0" w:tplc="D9AE68DE">
+    <w:tmpl w:val="E444C1B8"/>
+    <w:lvl w:ilvl="0" w:tplc="21B46A4C" w:tentative="1">
       <w:start w:val="1"/>
       <w:numFmt w:val="bullet"/>
-      <w:lvlText w:val="•"/>
+      <w:lvlText w:val="●"/>
       <w:lvlJc w:val="left"/>
       <w:pPr>
-        <w:ind w:left="400" w:hanging="260"/>
+        <w:ind w:left="720" w:hanging="360"/>
       </w:pPr>
     </w:lvl>
-    <w:lvl w:ilvl="1" w:tplc="6C08E8F6" w:tentative="1">
+    <w:lvl w:ilvl="1" w:tplc="821262CA" w:tentative="1">
       <w:start w:val="1"/>
       <w:numFmt w:val="bullet"/>
-      <w:lvlText w:val="–"/>
+      <w:lvlText w:val="○"/>
       <w:lvlJc w:val="left"/>
       <w:pPr>
-        <w:ind w:left="760" w:hanging="260"/>
+        <w:ind w:left="1440" w:hanging="360"/>
       </w:pPr>
     </w:lvl>
-    <w:lvl w:ilvl="2" w:tplc="C8C6029A" w:tentative="1">
+    <w:lvl w:ilvl="2" w:tplc="6FF0D142" w:tentative="1">
       <w:start w:val="1"/>
       <w:numFmt w:val="bullet"/>
-      <w:lvlText w:val="·"/>
+      <w:lvlText w:val="■"/>
       <w:lvlJc w:val="left"/>
       <w:pPr>
-        <w:ind w:left="1120" w:hanging="260"/>
+        <w:ind w:left="2160" w:hanging="360"/>
       </w:pPr>
     </w:lvl>
-    <w:lvl w:ilvl="3" w:tplc="3D9CFBC6">
+    <w:lvl w:ilvl="3" w:tplc="514EA804" w:tentative="1">
+      <w:start w:val="1"/>
+      <w:numFmt w:val="bullet"/>
+      <w:lvlText w:val="●"/>
+      <w:lvlJc w:val="left"/>
+      <w:pPr>
+        <w:ind w:left="2880" w:hanging="360"/>
+      </w:pPr>
+    </w:lvl>
+    <w:lvl w:ilvl="4" w:tplc="4CD4BB82" w:tentative="1">
+      <w:start w:val="1"/>
+      <w:numFmt w:val="bullet"/>
+      <w:lvlText w:val="○"/>
+      <w:lvlJc w:val="left"/>
+      <w:pPr>
+        <w:ind w:left="3600" w:hanging="360"/>
+      </w:pPr>
+    </w:lvl>
+    <w:lvl w:ilvl="5" w:tplc="F6E44D30" w:tentative="1">
+      <w:start w:val="1"/>
+      <w:numFmt w:val="bullet"/>
+      <w:lvlText w:val="■"/>
+      <w:lvlJc w:val="left"/>
+      <w:pPr>
+        <w:ind w:left="4320" w:hanging="360"/>
+      </w:pPr>
+    </w:lvl>
+    <w:lvl w:ilvl="6" w:tplc="7E0AC2C6" w:tentative="1">
+      <w:start w:val="1"/>
+      <w:numFmt w:val="bullet"/>
+      <w:lvlText w:val="●"/>
+      <w:lvlJc w:val="left"/>
+      <w:pPr>
+        <w:ind w:left="5040" w:hanging="360"/>
+      </w:pPr>
+    </w:lvl>
+    <w:lvl w:ilvl="7" w:tplc="B4BE744E" w:tentative="1">
+      <w:start w:val="1"/>
+      <w:numFmt w:val="bullet"/>
+      <w:lvlText w:val="●"/>
+      <w:lvlJc w:val="left"/>
+      <w:pPr>
+        <w:ind w:left="5760" w:hanging="360"/>
+      </w:pPr>
+    </w:lvl>
+    <w:lvl w:ilvl="8" w:tplc="57248B12" w:tentative="1">
+      <w:start w:val="1"/>
+      <w:numFmt w:val="bullet"/>
+      <w:lvlText w:val="●"/>
+      <w:lvlJc w:val="left"/>
+      <w:pPr>
+        <w:ind w:left="6480" w:hanging="360"/>
+      </w:pPr>
+    </w:lvl>
+  </w:abstractNum>
+  <w:abstractNum w:abstractNumId="2" w15:restartNumberingAfterBreak="0">
+    <w:nsid w:val="5E9F465D"/>
+    <w:multiLevelType w:val="hybridMultilevel"/>
+    <w:tmpl w:val="31A63D66"/>
+    <w:lvl w:ilvl="0" w:tplc="BE3A56C0">
+      <w:start w:val="1"/>
+      <w:numFmt w:val="decimal"/>
+      <w:lvlText w:val="%1."/>
+      <w:lvlJc w:val="left"/>
+      <w:pPr>
+        <w:ind w:left="420" w:hanging="300"/>
+      </w:pPr>
+    </w:lvl>
+    <w:lvl w:ilvl="1" w:tplc="80E413E0">
       <w:numFmt w:val="decimal"/>
       <w:lvlText w:val=""/>
       <w:lvlJc w:val="left"/>
     </w:lvl>
-    <w:lvl w:ilvl="4" w:tplc="8474D29A">
+    <w:lvl w:ilvl="2" w:tplc="CA9426EC">
       <w:numFmt w:val="decimal"/>
       <w:lvlText w:val=""/>
       <w:lvlJc w:val="left"/>
     </w:lvl>
-    <w:lvl w:ilvl="5" w:tplc="0FC8B620">
+    <w:lvl w:ilvl="3" w:tplc="BA02553C">
       <w:numFmt w:val="decimal"/>
       <w:lvlText w:val=""/>
       <w:lvlJc w:val="left"/>
     </w:lvl>
-    <w:lvl w:ilvl="6" w:tplc="7CFEB98C">
+    <w:lvl w:ilvl="4" w:tplc="37DEAD0A">
       <w:numFmt w:val="decimal"/>
       <w:lvlText w:val=""/>
       <w:lvlJc w:val="left"/>
     </w:lvl>
-    <w:lvl w:ilvl="7" w:tplc="D7DCD39A">
+    <w:lvl w:ilvl="5" w:tplc="FD203842">
       <w:numFmt w:val="decimal"/>
       <w:lvlText w:val=""/>
       <w:lvlJc w:val="left"/>
     </w:lvl>
-    <w:lvl w:ilvl="8" w:tplc="44421D94">
+    <w:lvl w:ilvl="6" w:tplc="B96A85AC">
+      <w:numFmt w:val="decimal"/>
+      <w:lvlText w:val=""/>
+      <w:lvlJc w:val="left"/>
+    </w:lvl>
+    <w:lvl w:ilvl="7" w:tplc="B06CB6EA">
+      <w:numFmt w:val="decimal"/>
+      <w:lvlText w:val=""/>
+      <w:lvlJc w:val="left"/>
+    </w:lvl>
+    <w:lvl w:ilvl="8" w:tplc="DFEC0D40">
       <w:numFmt w:val="decimal"/>
       <w:lvlText w:val=""/>
       <w:lvlJc w:val="left"/>
     </w:lvl>
   </w:abstractNum>
-  <w:abstractNum w:abstractNumId="2" w15:restartNumberingAfterBreak="0">
-    <w:nsid w:val="387C3A73"/>
-    <w:multiLevelType w:val="hybridMultilevel"/>
-    <w:tmpl w:val="23FCD1B8"/>
-    <w:lvl w:ilvl="0" w:tplc="38C2EFBC" w:tentative="1">
-      <w:start w:val="1"/>
-      <w:numFmt w:val="bullet"/>
-      <w:lvlText w:val="●"/>
-      <w:lvlJc w:val="left"/>
-      <w:pPr>
-        <w:ind w:left="720" w:hanging="360"/>
-      </w:pPr>
-    </w:lvl>
-    <w:lvl w:ilvl="1" w:tplc="C682DDC4" w:tentative="1">
-      <w:start w:val="1"/>
-      <w:numFmt w:val="bullet"/>
-      <w:lvlText w:val="○"/>
-      <w:lvlJc w:val="left"/>
-      <w:pPr>
-        <w:ind w:left="1440" w:hanging="360"/>
-      </w:pPr>
-    </w:lvl>
-    <w:lvl w:ilvl="2" w:tplc="4D401030" w:tentative="1">
-      <w:start w:val="1"/>
-      <w:numFmt w:val="bullet"/>
-      <w:lvlText w:val="■"/>
-      <w:lvlJc w:val="left"/>
-      <w:pPr>
-        <w:ind w:left="2160" w:hanging="360"/>
-      </w:pPr>
-    </w:lvl>
-    <w:lvl w:ilvl="3" w:tplc="6E9EFF3E" w:tentative="1">
-      <w:start w:val="1"/>
-      <w:numFmt w:val="bullet"/>
-      <w:lvlText w:val="●"/>
-      <w:lvlJc w:val="left"/>
-      <w:pPr>
-        <w:ind w:left="2880" w:hanging="360"/>
-      </w:pPr>
-    </w:lvl>
-    <w:lvl w:ilvl="4" w:tplc="A00A11A0" w:tentative="1">
-      <w:start w:val="1"/>
-      <w:numFmt w:val="bullet"/>
-      <w:lvlText w:val="○"/>
-      <w:lvlJc w:val="left"/>
-      <w:pPr>
-        <w:ind w:left="3600" w:hanging="360"/>
-      </w:pPr>
-    </w:lvl>
-    <w:lvl w:ilvl="5" w:tplc="904068E8" w:tentative="1">
-      <w:start w:val="1"/>
-      <w:numFmt w:val="bullet"/>
-      <w:lvlText w:val="■"/>
-      <w:lvlJc w:val="left"/>
-      <w:pPr>
-        <w:ind w:left="4320" w:hanging="360"/>
-      </w:pPr>
-    </w:lvl>
-    <w:lvl w:ilvl="6" w:tplc="13EA4EF2" w:tentative="1">
-      <w:start w:val="1"/>
-      <w:numFmt w:val="bullet"/>
-      <w:lvlText w:val="●"/>
-      <w:lvlJc w:val="left"/>
-      <w:pPr>
-        <w:ind w:left="5040" w:hanging="360"/>
-      </w:pPr>
-    </w:lvl>
-    <w:lvl w:ilvl="7" w:tplc="0A7A4222" w:tentative="1">
-      <w:start w:val="1"/>
-      <w:numFmt w:val="bullet"/>
-      <w:lvlText w:val="●"/>
-      <w:lvlJc w:val="left"/>
-      <w:pPr>
-        <w:ind w:left="5760" w:hanging="360"/>
-      </w:pPr>
-    </w:lvl>
-    <w:lvl w:ilvl="8" w:tplc="63CE3842" w:tentative="1">
-      <w:start w:val="1"/>
-      <w:numFmt w:val="bullet"/>
-      <w:lvlText w:val="●"/>
-      <w:lvlJc w:val="left"/>
-      <w:pPr>
-        <w:ind w:left="6480" w:hanging="360"/>
-      </w:pPr>
-    </w:lvl>
-  </w:abstractNum>
-  <w:num w:numId="1" w16cid:durableId="1742483131">
+  <w:num w:numId="1" w16cid:durableId="1700350230">
+    <w:abstractNumId w:val="1"/>
+    <w:lvlOverride w:ilvl="0">
+      <w:startOverride w:val="1"/>
+    </w:lvlOverride>
+  </w:num>
+  <w:num w:numId="2" w16cid:durableId="2034648567">
     <w:abstractNumId w:val="2"/>
     <w:lvlOverride w:ilvl="0">
       <w:startOverride w:val="1"/>
     </w:lvlOverride>
   </w:num>
-  <w:num w:numId="2" w16cid:durableId="1985810194">
+  <w:num w:numId="3" w16cid:durableId="2077507218">
     <w:abstractNumId w:val="0"/>
-    <w:lvlOverride w:ilvl="0">
-      <w:startOverride w:val="1"/>
-    </w:lvlOverride>
-  </w:num>
-  <w:num w:numId="3" w16cid:durableId="225772729">
-    <w:abstractNumId w:val="1"/>
     <w:lvlOverride w:ilvl="0">
       <w:startOverride w:val="1"/>
     </w:lvlOverride>
@@ -4721,7 +4721,7 @@
     <w:autoRedefine/>
     <w:uiPriority w:val="39"/>
     <w:unhideWhenUsed/>
-    <w:rsid w:val="00B204A3"/>
+    <w:rsid w:val="00286929"/>
     <w:pPr>
       <w:spacing w:after="100"/>
     </w:pPr>

</xml_diff>

<commit_message>
Diseño responsivo y Configuración simplificada: sedes sin desactivar, sin bloqueo por equipo, auditoría como visor (SPEC 2.169-2.170)
</commit_message>
<xml_diff>
--- a/documentacion/Arquitectura_general.docx
+++ b/documentacion/Arquitectura_general.docx
@@ -448,7 +448,7 @@
     <w:sdt>
       <w:sdtPr>
         <w:alias w:val="Contenido"/>
-        <w:id w:val="564453673"/>
+        <w:id w:val="610020049"/>
       </w:sdtPr>
       <w:sdtEndPr/>
       <w:sdtContent>
@@ -477,7 +477,7 @@
           <w:r>
             <w:fldChar w:fldCharType="separate"/>
           </w:r>
-          <w:hyperlink w:anchor="_Toc243055154" w:history="1">
+          <w:hyperlink w:anchor="_Toc243304178" w:history="1">
             <w:r>
               <w:rPr>
                 <w:rStyle w:val="Hipervnculo"/>
@@ -501,7 +501,7 @@
               <w:rPr>
                 <w:noProof/>
               </w:rPr>
-              <w:instrText xml:space="preserve"> PAGEREF _Toc243055154 \h </w:instrText>
+              <w:instrText xml:space="preserve"> PAGEREF _Toc243304178 \h </w:instrText>
             </w:r>
             <w:r>
               <w:rPr>
@@ -544,7 +544,7 @@
               <w14:ligatures w14:val="standardContextual"/>
             </w:rPr>
           </w:pPr>
-          <w:hyperlink w:anchor="_Toc243055155" w:history="1">
+          <w:hyperlink w:anchor="_Toc243304179" w:history="1">
             <w:r>
               <w:rPr>
                 <w:rStyle w:val="Hipervnculo"/>
@@ -568,7 +568,7 @@
               <w:rPr>
                 <w:noProof/>
               </w:rPr>
-              <w:instrText xml:space="preserve"> PAGEREF _Toc243055155 \h </w:instrText>
+              <w:instrText xml:space="preserve"> PAGEREF _Toc243304179 \h </w:instrText>
             </w:r>
             <w:r>
               <w:rPr>
@@ -611,7 +611,7 @@
               <w14:ligatures w14:val="standardContextual"/>
             </w:rPr>
           </w:pPr>
-          <w:hyperlink w:anchor="_Toc243055156" w:history="1">
+          <w:hyperlink w:anchor="_Toc243304180" w:history="1">
             <w:r>
               <w:rPr>
                 <w:rStyle w:val="Hipervnculo"/>
@@ -635,7 +635,7 @@
               <w:rPr>
                 <w:noProof/>
               </w:rPr>
-              <w:instrText xml:space="preserve"> PAGEREF _Toc243055156 \h </w:instrText>
+              <w:instrText xml:space="preserve"> PAGEREF _Toc243304180 \h </w:instrText>
             </w:r>
             <w:r>
               <w:rPr>
@@ -678,7 +678,7 @@
               <w14:ligatures w14:val="standardContextual"/>
             </w:rPr>
           </w:pPr>
-          <w:hyperlink w:anchor="_Toc243055157" w:history="1">
+          <w:hyperlink w:anchor="_Toc243304181" w:history="1">
             <w:r>
               <w:rPr>
                 <w:rStyle w:val="Hipervnculo"/>
@@ -702,7 +702,7 @@
               <w:rPr>
                 <w:noProof/>
               </w:rPr>
-              <w:instrText xml:space="preserve"> PAGEREF _Toc243055157 \h </w:instrText>
+              <w:instrText xml:space="preserve"> PAGEREF _Toc243304181 \h </w:instrText>
             </w:r>
             <w:r>
               <w:rPr>
@@ -745,7 +745,7 @@
               <w14:ligatures w14:val="standardContextual"/>
             </w:rPr>
           </w:pPr>
-          <w:hyperlink w:anchor="_Toc243055158" w:history="1">
+          <w:hyperlink w:anchor="_Toc243304182" w:history="1">
             <w:r>
               <w:rPr>
                 <w:rStyle w:val="Hipervnculo"/>
@@ -769,7 +769,7 @@
               <w:rPr>
                 <w:noProof/>
               </w:rPr>
-              <w:instrText xml:space="preserve"> PAGEREF _Toc243055158 \h </w:instrText>
+              <w:instrText xml:space="preserve"> PAGEREF _Toc243304182 \h </w:instrText>
             </w:r>
             <w:r>
               <w:rPr>
@@ -812,7 +812,7 @@
               <w14:ligatures w14:val="standardContextual"/>
             </w:rPr>
           </w:pPr>
-          <w:hyperlink w:anchor="_Toc243055159" w:history="1">
+          <w:hyperlink w:anchor="_Toc243304183" w:history="1">
             <w:r>
               <w:rPr>
                 <w:rStyle w:val="Hipervnculo"/>
@@ -836,7 +836,7 @@
               <w:rPr>
                 <w:noProof/>
               </w:rPr>
-              <w:instrText xml:space="preserve"> PAGEREF _Toc243055159 \h </w:instrText>
+              <w:instrText xml:space="preserve"> PAGEREF _Toc243304183 \h </w:instrText>
             </w:r>
             <w:r>
               <w:rPr>
@@ -880,7 +880,7 @@
         <w:pStyle w:val="Ttulo1"/>
         <w:keepNext/>
       </w:pPr>
-      <w:bookmarkStart w:id="0" w:name="_Toc243055154"/>
+      <w:bookmarkStart w:id="0" w:name="_Toc243304178"/>
       <w:r>
         <w:t>1. Visión general</w:t>
       </w:r>
@@ -927,7 +927,7 @@
         <w:pStyle w:val="Ttulo1"/>
         <w:keepNext/>
       </w:pPr>
-      <w:bookmarkStart w:id="1" w:name="_Toc243055155"/>
+      <w:bookmarkStart w:id="1" w:name="_Toc243304179"/>
       <w:r>
         <w:t>2. Capas</w:t>
       </w:r>
@@ -1797,7 +1797,7 @@
         <w:pStyle w:val="Ttulo1"/>
         <w:keepNext/>
       </w:pPr>
-      <w:bookmarkStart w:id="2" w:name="_Toc243055156"/>
+      <w:bookmarkStart w:id="2" w:name="_Toc243304180"/>
       <w:r>
         <w:t>3. Flujo de una petición</w:t>
       </w:r>
@@ -2153,7 +2153,7 @@
         <w:pStyle w:val="Ttulo1"/>
         <w:keepNext/>
       </w:pPr>
-      <w:bookmarkStart w:id="3" w:name="_Toc243055157"/>
+      <w:bookmarkStart w:id="3" w:name="_Toc243304181"/>
       <w:r>
         <w:t>4. Módulos de dominio</w:t>
       </w:r>
@@ -3062,7 +3062,7 @@
         <w:pStyle w:val="Ttulo1"/>
         <w:keepNext/>
       </w:pPr>
-      <w:bookmarkStart w:id="4" w:name="_Toc243055158"/>
+      <w:bookmarkStart w:id="4" w:name="_Toc243304182"/>
       <w:r>
         <w:t>5. Despliegue</w:t>
       </w:r>
@@ -3213,7 +3213,7 @@
         <w:pStyle w:val="Ttulo1"/>
         <w:keepNext/>
       </w:pPr>
-      <w:bookmarkStart w:id="5" w:name="_Toc243055159"/>
+      <w:bookmarkStart w:id="5" w:name="_Toc243304183"/>
       <w:r>
         <w:t>6. Atributos de calidad que guían la arquitectura</w:t>
       </w:r>
@@ -3865,10 +3865,10 @@
 <file path=word/numbering.xml><?xml version="1.0" encoding="utf-8"?>
 <w:numbering xmlns:wpc="http://schemas.microsoft.com/office/word/2010/wordprocessingCanvas" xmlns:cx="http://schemas.microsoft.com/office/drawing/2014/chartex" xmlns:cx1="http://schemas.microsoft.com/office/drawing/2015/9/8/chartex" xmlns:cx2="http://schemas.microsoft.com/office/drawing/2015/10/21/chartex" xmlns:cx3="http://schemas.microsoft.com/office/drawing/2016/5/9/chartex" xmlns:cx4="http://schemas.microsoft.com/office/drawing/2016/5/10/chartex" xmlns:cx5="http://schemas.microsoft.com/office/drawing/2016/5/11/chartex" xmlns:cx6="http://schemas.microsoft.com/office/drawing/2016/5/12/chartex" xmlns:cx7="http://schemas.microsoft.com/office/drawing/2016/5/13/chartex" xmlns:cx8="http://schemas.microsoft.com/office/drawing/2016/5/14/chartex" xmlns:mc="http://schemas.openxmlformats.org/markup-compatibility/2006" xmlns:aink="http://schemas.microsoft.com/office/drawing/2016/ink" xmlns:am3d="http://schemas.microsoft.com/office/drawing/2017/model3d" xmlns:o="urn:schemas-microsoft-com:office:office" xmlns:oel="http://schemas.microsoft.com/office/2019/extlst" xmlns:r="http://schemas.openxmlformats.org/officeDocument/2006/relationships" xmlns:m="http://schemas.openxmlformats.org/officeDocument/2006/math" xmlns:v="urn:schemas-microsoft-com:vml" xmlns:wp14="http://schemas.microsoft.com/office/word/2010/wordprocessingDrawing" xmlns:wp="http://schemas.openxmlformats.org/drawingml/2006/wordprocessingDrawing" xmlns:w10="urn:schemas-microsoft-com:office:word" xmlns:w="http://schemas.openxmlformats.org/wordprocessingml/2006/main" xmlns:w14="http://schemas.microsoft.com/office/word/2010/wordml" xmlns:w15="http://schemas.microsoft.com/office/word/2012/wordml" xmlns:w16cex="http://schemas.microsoft.com/office/word/2018/wordml/cex" xmlns:w16cid="http://schemas.microsoft.com/office/word/2016/wordml/cid" xmlns:w16="http://schemas.microsoft.com/office/word/2018/wordml" xmlns:w16du="http://schemas.microsoft.com/office/word/2023/wordml/word16du" xmlns:w16sdtdh="http://schemas.microsoft.com/office/word/2020/wordml/sdtdatahash" xmlns:w16sdtfl="http://schemas.microsoft.com/office/word/2024/wordml/sdtformatlock" xmlns:w16se="http://schemas.microsoft.com/office/word/2015/wordml/symex" xmlns:wpg="http://schemas.microsoft.com/office/word/2010/wordprocessingGroup" xmlns:wpi="http://schemas.microsoft.com/office/word/2010/wordprocessingInk" xmlns:wne="http://schemas.microsoft.com/office/word/2006/wordml" xmlns:wps="http://schemas.microsoft.com/office/word/2010/wordprocessingShape" mc:Ignorable="w14 w15 w16se w16cid w16 w16cex w16sdtdh w16sdtfl w16du wp14">
   <w:abstractNum w:abstractNumId="0" w15:restartNumberingAfterBreak="0">
-    <w:nsid w:val="1649207F"/>
+    <w:nsid w:val="09275EED"/>
     <w:multiLevelType w:val="hybridMultilevel"/>
-    <w:tmpl w:val="C7E663DA"/>
-    <w:lvl w:ilvl="0" w:tplc="00DC3CE0">
+    <w:tmpl w:val="0310D9EC"/>
+    <w:lvl w:ilvl="0" w:tplc="D620338A">
       <w:start w:val="1"/>
       <w:numFmt w:val="bullet"/>
       <w:lvlText w:val="•"/>
@@ -3877,7 +3877,7 @@
         <w:ind w:left="400" w:hanging="260"/>
       </w:pPr>
     </w:lvl>
-    <w:lvl w:ilvl="1" w:tplc="D95C4B54" w:tentative="1">
+    <w:lvl w:ilvl="1" w:tplc="B658F896" w:tentative="1">
       <w:start w:val="1"/>
       <w:numFmt w:val="bullet"/>
       <w:lvlText w:val="–"/>
@@ -3886,7 +3886,7 @@
         <w:ind w:left="760" w:hanging="260"/>
       </w:pPr>
     </w:lvl>
-    <w:lvl w:ilvl="2" w:tplc="41DC0DBA" w:tentative="1">
+    <w:lvl w:ilvl="2" w:tplc="3D6A5DAA" w:tentative="1">
       <w:start w:val="1"/>
       <w:numFmt w:val="bullet"/>
       <w:lvlText w:val="·"/>
@@ -3895,42 +3895,42 @@
         <w:ind w:left="1120" w:hanging="260"/>
       </w:pPr>
     </w:lvl>
-    <w:lvl w:ilvl="3" w:tplc="F71478FA">
+    <w:lvl w:ilvl="3" w:tplc="D2EC2D70">
       <w:numFmt w:val="decimal"/>
       <w:lvlText w:val=""/>
       <w:lvlJc w:val="left"/>
     </w:lvl>
-    <w:lvl w:ilvl="4" w:tplc="B38A246A">
+    <w:lvl w:ilvl="4" w:tplc="8B6C5A18">
       <w:numFmt w:val="decimal"/>
       <w:lvlText w:val=""/>
       <w:lvlJc w:val="left"/>
     </w:lvl>
-    <w:lvl w:ilvl="5" w:tplc="4FD0324A">
+    <w:lvl w:ilvl="5" w:tplc="B942BBB0">
       <w:numFmt w:val="decimal"/>
       <w:lvlText w:val=""/>
       <w:lvlJc w:val="left"/>
     </w:lvl>
-    <w:lvl w:ilvl="6" w:tplc="B9126C6C">
+    <w:lvl w:ilvl="6" w:tplc="E16EE1F0">
       <w:numFmt w:val="decimal"/>
       <w:lvlText w:val=""/>
       <w:lvlJc w:val="left"/>
     </w:lvl>
-    <w:lvl w:ilvl="7" w:tplc="D2E89F5C">
+    <w:lvl w:ilvl="7" w:tplc="7312FC6E">
       <w:numFmt w:val="decimal"/>
       <w:lvlText w:val=""/>
       <w:lvlJc w:val="left"/>
     </w:lvl>
-    <w:lvl w:ilvl="8" w:tplc="05BAFAA8">
+    <w:lvl w:ilvl="8" w:tplc="97065B4A">
       <w:numFmt w:val="decimal"/>
       <w:lvlText w:val=""/>
       <w:lvlJc w:val="left"/>
     </w:lvl>
   </w:abstractNum>
   <w:abstractNum w:abstractNumId="1" w15:restartNumberingAfterBreak="0">
-    <w:nsid w:val="56AD606E"/>
+    <w:nsid w:val="0C0F4F60"/>
     <w:multiLevelType w:val="hybridMultilevel"/>
-    <w:tmpl w:val="E444C1B8"/>
-    <w:lvl w:ilvl="0" w:tplc="21B46A4C" w:tentative="1">
+    <w:tmpl w:val="61E04F5A"/>
+    <w:lvl w:ilvl="0" w:tplc="BB9E2846" w:tentative="1">
       <w:start w:val="1"/>
       <w:numFmt w:val="bullet"/>
       <w:lvlText w:val="●"/>
@@ -3939,7 +3939,7 @@
         <w:ind w:left="720" w:hanging="360"/>
       </w:pPr>
     </w:lvl>
-    <w:lvl w:ilvl="1" w:tplc="821262CA" w:tentative="1">
+    <w:lvl w:ilvl="1" w:tplc="91D0629C" w:tentative="1">
       <w:start w:val="1"/>
       <w:numFmt w:val="bullet"/>
       <w:lvlText w:val="○"/>
@@ -3948,7 +3948,7 @@
         <w:ind w:left="1440" w:hanging="360"/>
       </w:pPr>
     </w:lvl>
-    <w:lvl w:ilvl="2" w:tplc="6FF0D142" w:tentative="1">
+    <w:lvl w:ilvl="2" w:tplc="83CA4FE8" w:tentative="1">
       <w:start w:val="1"/>
       <w:numFmt w:val="bullet"/>
       <w:lvlText w:val="■"/>
@@ -3957,7 +3957,7 @@
         <w:ind w:left="2160" w:hanging="360"/>
       </w:pPr>
     </w:lvl>
-    <w:lvl w:ilvl="3" w:tplc="514EA804" w:tentative="1">
+    <w:lvl w:ilvl="3" w:tplc="EB20B318" w:tentative="1">
       <w:start w:val="1"/>
       <w:numFmt w:val="bullet"/>
       <w:lvlText w:val="●"/>
@@ -3966,7 +3966,7 @@
         <w:ind w:left="2880" w:hanging="360"/>
       </w:pPr>
     </w:lvl>
-    <w:lvl w:ilvl="4" w:tplc="4CD4BB82" w:tentative="1">
+    <w:lvl w:ilvl="4" w:tplc="2028DFE8" w:tentative="1">
       <w:start w:val="1"/>
       <w:numFmt w:val="bullet"/>
       <w:lvlText w:val="○"/>
@@ -3975,7 +3975,7 @@
         <w:ind w:left="3600" w:hanging="360"/>
       </w:pPr>
     </w:lvl>
-    <w:lvl w:ilvl="5" w:tplc="F6E44D30" w:tentative="1">
+    <w:lvl w:ilvl="5" w:tplc="4B28908E" w:tentative="1">
       <w:start w:val="1"/>
       <w:numFmt w:val="bullet"/>
       <w:lvlText w:val="■"/>
@@ -3984,7 +3984,7 @@
         <w:ind w:left="4320" w:hanging="360"/>
       </w:pPr>
     </w:lvl>
-    <w:lvl w:ilvl="6" w:tplc="7E0AC2C6" w:tentative="1">
+    <w:lvl w:ilvl="6" w:tplc="14F8ADC2" w:tentative="1">
       <w:start w:val="1"/>
       <w:numFmt w:val="bullet"/>
       <w:lvlText w:val="●"/>
@@ -3993,7 +3993,7 @@
         <w:ind w:left="5040" w:hanging="360"/>
       </w:pPr>
     </w:lvl>
-    <w:lvl w:ilvl="7" w:tplc="B4BE744E" w:tentative="1">
+    <w:lvl w:ilvl="7" w:tplc="5E4AC994" w:tentative="1">
       <w:start w:val="1"/>
       <w:numFmt w:val="bullet"/>
       <w:lvlText w:val="●"/>
@@ -4002,7 +4002,7 @@
         <w:ind w:left="5760" w:hanging="360"/>
       </w:pPr>
     </w:lvl>
-    <w:lvl w:ilvl="8" w:tplc="57248B12" w:tentative="1">
+    <w:lvl w:ilvl="8" w:tplc="BBBCA338" w:tentative="1">
       <w:start w:val="1"/>
       <w:numFmt w:val="bullet"/>
       <w:lvlText w:val="●"/>
@@ -4013,10 +4013,10 @@
     </w:lvl>
   </w:abstractNum>
   <w:abstractNum w:abstractNumId="2" w15:restartNumberingAfterBreak="0">
-    <w:nsid w:val="5E9F465D"/>
+    <w:nsid w:val="44CF0349"/>
     <w:multiLevelType w:val="hybridMultilevel"/>
-    <w:tmpl w:val="31A63D66"/>
-    <w:lvl w:ilvl="0" w:tplc="BE3A56C0">
+    <w:tmpl w:val="87788296"/>
+    <w:lvl w:ilvl="0" w:tplc="5B02C534">
       <w:start w:val="1"/>
       <w:numFmt w:val="decimal"/>
       <w:lvlText w:val="%1."/>
@@ -4025,60 +4025,60 @@
         <w:ind w:left="420" w:hanging="300"/>
       </w:pPr>
     </w:lvl>
-    <w:lvl w:ilvl="1" w:tplc="80E413E0">
+    <w:lvl w:ilvl="1" w:tplc="0D8ADBA0">
       <w:numFmt w:val="decimal"/>
       <w:lvlText w:val=""/>
       <w:lvlJc w:val="left"/>
     </w:lvl>
-    <w:lvl w:ilvl="2" w:tplc="CA9426EC">
+    <w:lvl w:ilvl="2" w:tplc="379E29C2">
       <w:numFmt w:val="decimal"/>
       <w:lvlText w:val=""/>
       <w:lvlJc w:val="left"/>
     </w:lvl>
-    <w:lvl w:ilvl="3" w:tplc="BA02553C">
+    <w:lvl w:ilvl="3" w:tplc="47120264">
       <w:numFmt w:val="decimal"/>
       <w:lvlText w:val=""/>
       <w:lvlJc w:val="left"/>
     </w:lvl>
-    <w:lvl w:ilvl="4" w:tplc="37DEAD0A">
+    <w:lvl w:ilvl="4" w:tplc="EFC4EEEE">
       <w:numFmt w:val="decimal"/>
       <w:lvlText w:val=""/>
       <w:lvlJc w:val="left"/>
     </w:lvl>
-    <w:lvl w:ilvl="5" w:tplc="FD203842">
+    <w:lvl w:ilvl="5" w:tplc="C684288A">
       <w:numFmt w:val="decimal"/>
       <w:lvlText w:val=""/>
       <w:lvlJc w:val="left"/>
     </w:lvl>
-    <w:lvl w:ilvl="6" w:tplc="B96A85AC">
+    <w:lvl w:ilvl="6" w:tplc="B8260C92">
       <w:numFmt w:val="decimal"/>
       <w:lvlText w:val=""/>
       <w:lvlJc w:val="left"/>
     </w:lvl>
-    <w:lvl w:ilvl="7" w:tplc="B06CB6EA">
+    <w:lvl w:ilvl="7" w:tplc="ADF41A50">
       <w:numFmt w:val="decimal"/>
       <w:lvlText w:val=""/>
       <w:lvlJc w:val="left"/>
     </w:lvl>
-    <w:lvl w:ilvl="8" w:tplc="DFEC0D40">
+    <w:lvl w:ilvl="8" w:tplc="D9ECDEA0">
       <w:numFmt w:val="decimal"/>
       <w:lvlText w:val=""/>
       <w:lvlJc w:val="left"/>
     </w:lvl>
   </w:abstractNum>
-  <w:num w:numId="1" w16cid:durableId="1700350230">
+  <w:num w:numId="1" w16cid:durableId="1283614163">
     <w:abstractNumId w:val="1"/>
     <w:lvlOverride w:ilvl="0">
       <w:startOverride w:val="1"/>
     </w:lvlOverride>
   </w:num>
-  <w:num w:numId="2" w16cid:durableId="2034648567">
+  <w:num w:numId="2" w16cid:durableId="472449273">
     <w:abstractNumId w:val="2"/>
     <w:lvlOverride w:ilvl="0">
       <w:startOverride w:val="1"/>
     </w:lvlOverride>
   </w:num>
-  <w:num w:numId="3" w16cid:durableId="2077507218">
+  <w:num w:numId="3" w16cid:durableId="828711516">
     <w:abstractNumId w:val="0"/>
     <w:lvlOverride w:ilvl="0">
       <w:startOverride w:val="1"/>
@@ -4721,7 +4721,7 @@
     <w:autoRedefine/>
     <w:uiPriority w:val="39"/>
     <w:unhideWhenUsed/>
-    <w:rsid w:val="00286929"/>
+    <w:rsid w:val="0077204B"/>
     <w:pPr>
       <w:spacing w:after="100"/>
     </w:pPr>

</xml_diff>

<commit_message>
Equipo sin sede toma la de su persona al importar y al darle sede (SPEC 2.171)
</commit_message>
<xml_diff>
--- a/documentacion/Arquitectura_general.docx
+++ b/documentacion/Arquitectura_general.docx
@@ -448,7 +448,7 @@
     <w:sdt>
       <w:sdtPr>
         <w:alias w:val="Contenido"/>
-        <w:id w:val="610020049"/>
+        <w:id w:val="2019728318"/>
       </w:sdtPr>
       <w:sdtEndPr/>
       <w:sdtContent>
@@ -477,7 +477,7 @@
           <w:r>
             <w:fldChar w:fldCharType="separate"/>
           </w:r>
-          <w:hyperlink w:anchor="_Toc243304178" w:history="1">
+          <w:hyperlink w:anchor="_Toc243305283" w:history="1">
             <w:r>
               <w:rPr>
                 <w:rStyle w:val="Hipervnculo"/>
@@ -501,7 +501,7 @@
               <w:rPr>
                 <w:noProof/>
               </w:rPr>
-              <w:instrText xml:space="preserve"> PAGEREF _Toc243304178 \h </w:instrText>
+              <w:instrText xml:space="preserve"> PAGEREF _Toc243305283 \h </w:instrText>
             </w:r>
             <w:r>
               <w:rPr>
@@ -544,7 +544,7 @@
               <w14:ligatures w14:val="standardContextual"/>
             </w:rPr>
           </w:pPr>
-          <w:hyperlink w:anchor="_Toc243304179" w:history="1">
+          <w:hyperlink w:anchor="_Toc243305284" w:history="1">
             <w:r>
               <w:rPr>
                 <w:rStyle w:val="Hipervnculo"/>
@@ -568,7 +568,7 @@
               <w:rPr>
                 <w:noProof/>
               </w:rPr>
-              <w:instrText xml:space="preserve"> PAGEREF _Toc243304179 \h </w:instrText>
+              <w:instrText xml:space="preserve"> PAGEREF _Toc243305284 \h </w:instrText>
             </w:r>
             <w:r>
               <w:rPr>
@@ -611,7 +611,7 @@
               <w14:ligatures w14:val="standardContextual"/>
             </w:rPr>
           </w:pPr>
-          <w:hyperlink w:anchor="_Toc243304180" w:history="1">
+          <w:hyperlink w:anchor="_Toc243305285" w:history="1">
             <w:r>
               <w:rPr>
                 <w:rStyle w:val="Hipervnculo"/>
@@ -635,7 +635,7 @@
               <w:rPr>
                 <w:noProof/>
               </w:rPr>
-              <w:instrText xml:space="preserve"> PAGEREF _Toc243304180 \h </w:instrText>
+              <w:instrText xml:space="preserve"> PAGEREF _Toc243305285 \h </w:instrText>
             </w:r>
             <w:r>
               <w:rPr>
@@ -678,7 +678,7 @@
               <w14:ligatures w14:val="standardContextual"/>
             </w:rPr>
           </w:pPr>
-          <w:hyperlink w:anchor="_Toc243304181" w:history="1">
+          <w:hyperlink w:anchor="_Toc243305286" w:history="1">
             <w:r>
               <w:rPr>
                 <w:rStyle w:val="Hipervnculo"/>
@@ -702,7 +702,7 @@
               <w:rPr>
                 <w:noProof/>
               </w:rPr>
-              <w:instrText xml:space="preserve"> PAGEREF _Toc243304181 \h </w:instrText>
+              <w:instrText xml:space="preserve"> PAGEREF _Toc243305286 \h </w:instrText>
             </w:r>
             <w:r>
               <w:rPr>
@@ -745,7 +745,7 @@
               <w14:ligatures w14:val="standardContextual"/>
             </w:rPr>
           </w:pPr>
-          <w:hyperlink w:anchor="_Toc243304182" w:history="1">
+          <w:hyperlink w:anchor="_Toc243305287" w:history="1">
             <w:r>
               <w:rPr>
                 <w:rStyle w:val="Hipervnculo"/>
@@ -769,7 +769,7 @@
               <w:rPr>
                 <w:noProof/>
               </w:rPr>
-              <w:instrText xml:space="preserve"> PAGEREF _Toc243304182 \h </w:instrText>
+              <w:instrText xml:space="preserve"> PAGEREF _Toc243305287 \h </w:instrText>
             </w:r>
             <w:r>
               <w:rPr>
@@ -812,7 +812,7 @@
               <w14:ligatures w14:val="standardContextual"/>
             </w:rPr>
           </w:pPr>
-          <w:hyperlink w:anchor="_Toc243304183" w:history="1">
+          <w:hyperlink w:anchor="_Toc243305288" w:history="1">
             <w:r>
               <w:rPr>
                 <w:rStyle w:val="Hipervnculo"/>
@@ -836,7 +836,7 @@
               <w:rPr>
                 <w:noProof/>
               </w:rPr>
-              <w:instrText xml:space="preserve"> PAGEREF _Toc243304183 \h </w:instrText>
+              <w:instrText xml:space="preserve"> PAGEREF _Toc243305288 \h </w:instrText>
             </w:r>
             <w:r>
               <w:rPr>
@@ -880,7 +880,7 @@
         <w:pStyle w:val="Ttulo1"/>
         <w:keepNext/>
       </w:pPr>
-      <w:bookmarkStart w:id="0" w:name="_Toc243304178"/>
+      <w:bookmarkStart w:id="0" w:name="_Toc243305283"/>
       <w:r>
         <w:t>1. Visión general</w:t>
       </w:r>
@@ -927,7 +927,7 @@
         <w:pStyle w:val="Ttulo1"/>
         <w:keepNext/>
       </w:pPr>
-      <w:bookmarkStart w:id="1" w:name="_Toc243304179"/>
+      <w:bookmarkStart w:id="1" w:name="_Toc243305284"/>
       <w:r>
         <w:t>2. Capas</w:t>
       </w:r>
@@ -1797,7 +1797,7 @@
         <w:pStyle w:val="Ttulo1"/>
         <w:keepNext/>
       </w:pPr>
-      <w:bookmarkStart w:id="2" w:name="_Toc243304180"/>
+      <w:bookmarkStart w:id="2" w:name="_Toc243305285"/>
       <w:r>
         <w:t>3. Flujo de una petición</w:t>
       </w:r>
@@ -2153,7 +2153,7 @@
         <w:pStyle w:val="Ttulo1"/>
         <w:keepNext/>
       </w:pPr>
-      <w:bookmarkStart w:id="3" w:name="_Toc243304181"/>
+      <w:bookmarkStart w:id="3" w:name="_Toc243305286"/>
       <w:r>
         <w:t>4. Módulos de dominio</w:t>
       </w:r>
@@ -3062,7 +3062,7 @@
         <w:pStyle w:val="Ttulo1"/>
         <w:keepNext/>
       </w:pPr>
-      <w:bookmarkStart w:id="4" w:name="_Toc243304182"/>
+      <w:bookmarkStart w:id="4" w:name="_Toc243305287"/>
       <w:r>
         <w:t>5. Despliegue</w:t>
       </w:r>
@@ -3213,7 +3213,7 @@
         <w:pStyle w:val="Ttulo1"/>
         <w:keepNext/>
       </w:pPr>
-      <w:bookmarkStart w:id="5" w:name="_Toc243304183"/>
+      <w:bookmarkStart w:id="5" w:name="_Toc243305288"/>
       <w:r>
         <w:t>6. Atributos de calidad que guían la arquitectura</w:t>
       </w:r>
@@ -3865,221 +3865,221 @@
 <file path=word/numbering.xml><?xml version="1.0" encoding="utf-8"?>
 <w:numbering xmlns:wpc="http://schemas.microsoft.com/office/word/2010/wordprocessingCanvas" xmlns:cx="http://schemas.microsoft.com/office/drawing/2014/chartex" xmlns:cx1="http://schemas.microsoft.com/office/drawing/2015/9/8/chartex" xmlns:cx2="http://schemas.microsoft.com/office/drawing/2015/10/21/chartex" xmlns:cx3="http://schemas.microsoft.com/office/drawing/2016/5/9/chartex" xmlns:cx4="http://schemas.microsoft.com/office/drawing/2016/5/10/chartex" xmlns:cx5="http://schemas.microsoft.com/office/drawing/2016/5/11/chartex" xmlns:cx6="http://schemas.microsoft.com/office/drawing/2016/5/12/chartex" xmlns:cx7="http://schemas.microsoft.com/office/drawing/2016/5/13/chartex" xmlns:cx8="http://schemas.microsoft.com/office/drawing/2016/5/14/chartex" xmlns:mc="http://schemas.openxmlformats.org/markup-compatibility/2006" xmlns:aink="http://schemas.microsoft.com/office/drawing/2016/ink" xmlns:am3d="http://schemas.microsoft.com/office/drawing/2017/model3d" xmlns:o="urn:schemas-microsoft-com:office:office" xmlns:oel="http://schemas.microsoft.com/office/2019/extlst" xmlns:r="http://schemas.openxmlformats.org/officeDocument/2006/relationships" xmlns:m="http://schemas.openxmlformats.org/officeDocument/2006/math" xmlns:v="urn:schemas-microsoft-com:vml" xmlns:wp14="http://schemas.microsoft.com/office/word/2010/wordprocessingDrawing" xmlns:wp="http://schemas.openxmlformats.org/drawingml/2006/wordprocessingDrawing" xmlns:w10="urn:schemas-microsoft-com:office:word" xmlns:w="http://schemas.openxmlformats.org/wordprocessingml/2006/main" xmlns:w14="http://schemas.microsoft.com/office/word/2010/wordml" xmlns:w15="http://schemas.microsoft.com/office/word/2012/wordml" xmlns:w16cex="http://schemas.microsoft.com/office/word/2018/wordml/cex" xmlns:w16cid="http://schemas.microsoft.com/office/word/2016/wordml/cid" xmlns:w16="http://schemas.microsoft.com/office/word/2018/wordml" xmlns:w16du="http://schemas.microsoft.com/office/word/2023/wordml/word16du" xmlns:w16sdtdh="http://schemas.microsoft.com/office/word/2020/wordml/sdtdatahash" xmlns:w16sdtfl="http://schemas.microsoft.com/office/word/2024/wordml/sdtformatlock" xmlns:w16se="http://schemas.microsoft.com/office/word/2015/wordml/symex" xmlns:wpg="http://schemas.microsoft.com/office/word/2010/wordprocessingGroup" xmlns:wpi="http://schemas.microsoft.com/office/word/2010/wordprocessingInk" xmlns:wne="http://schemas.microsoft.com/office/word/2006/wordml" xmlns:wps="http://schemas.microsoft.com/office/word/2010/wordprocessingShape" mc:Ignorable="w14 w15 w16se w16cid w16 w16cex w16sdtdh w16sdtfl w16du wp14">
   <w:abstractNum w:abstractNumId="0" w15:restartNumberingAfterBreak="0">
-    <w:nsid w:val="09275EED"/>
+    <w:nsid w:val="0E1273CC"/>
     <w:multiLevelType w:val="hybridMultilevel"/>
-    <w:tmpl w:val="0310D9EC"/>
-    <w:lvl w:ilvl="0" w:tplc="D620338A">
+    <w:tmpl w:val="493CF496"/>
+    <w:lvl w:ilvl="0" w:tplc="C1D0F5B2">
       <w:start w:val="1"/>
-      <w:numFmt w:val="bullet"/>
-      <w:lvlText w:val="•"/>
+      <w:numFmt w:val="decimal"/>
+      <w:lvlText w:val="%1."/>
       <w:lvlJc w:val="left"/>
       <w:pPr>
-        <w:ind w:left="400" w:hanging="260"/>
+        <w:ind w:left="420" w:hanging="300"/>
       </w:pPr>
     </w:lvl>
-    <w:lvl w:ilvl="1" w:tplc="B658F896" w:tentative="1">
-      <w:start w:val="1"/>
-      <w:numFmt w:val="bullet"/>
-      <w:lvlText w:val="–"/>
-      <w:lvlJc w:val="left"/>
-      <w:pPr>
-        <w:ind w:left="760" w:hanging="260"/>
-      </w:pPr>
-    </w:lvl>
-    <w:lvl w:ilvl="2" w:tplc="3D6A5DAA" w:tentative="1">
-      <w:start w:val="1"/>
-      <w:numFmt w:val="bullet"/>
-      <w:lvlText w:val="·"/>
-      <w:lvlJc w:val="left"/>
-      <w:pPr>
-        <w:ind w:left="1120" w:hanging="260"/>
-      </w:pPr>
-    </w:lvl>
-    <w:lvl w:ilvl="3" w:tplc="D2EC2D70">
+    <w:lvl w:ilvl="1" w:tplc="3BB29484">
       <w:numFmt w:val="decimal"/>
       <w:lvlText w:val=""/>
       <w:lvlJc w:val="left"/>
     </w:lvl>
-    <w:lvl w:ilvl="4" w:tplc="8B6C5A18">
+    <w:lvl w:ilvl="2" w:tplc="1B028820">
       <w:numFmt w:val="decimal"/>
       <w:lvlText w:val=""/>
       <w:lvlJc w:val="left"/>
     </w:lvl>
-    <w:lvl w:ilvl="5" w:tplc="B942BBB0">
+    <w:lvl w:ilvl="3" w:tplc="A9AE0EB8">
       <w:numFmt w:val="decimal"/>
       <w:lvlText w:val=""/>
       <w:lvlJc w:val="left"/>
     </w:lvl>
-    <w:lvl w:ilvl="6" w:tplc="E16EE1F0">
+    <w:lvl w:ilvl="4" w:tplc="1DF6E282">
       <w:numFmt w:val="decimal"/>
       <w:lvlText w:val=""/>
       <w:lvlJc w:val="left"/>
     </w:lvl>
-    <w:lvl w:ilvl="7" w:tplc="7312FC6E">
+    <w:lvl w:ilvl="5" w:tplc="2DD4A86C">
       <w:numFmt w:val="decimal"/>
       <w:lvlText w:val=""/>
       <w:lvlJc w:val="left"/>
     </w:lvl>
-    <w:lvl w:ilvl="8" w:tplc="97065B4A">
+    <w:lvl w:ilvl="6" w:tplc="CCA445D6">
+      <w:numFmt w:val="decimal"/>
+      <w:lvlText w:val=""/>
+      <w:lvlJc w:val="left"/>
+    </w:lvl>
+    <w:lvl w:ilvl="7" w:tplc="8B50E61A">
+      <w:numFmt w:val="decimal"/>
+      <w:lvlText w:val=""/>
+      <w:lvlJc w:val="left"/>
+    </w:lvl>
+    <w:lvl w:ilvl="8" w:tplc="3A84316A">
       <w:numFmt w:val="decimal"/>
       <w:lvlText w:val=""/>
       <w:lvlJc w:val="left"/>
     </w:lvl>
   </w:abstractNum>
   <w:abstractNum w:abstractNumId="1" w15:restartNumberingAfterBreak="0">
-    <w:nsid w:val="0C0F4F60"/>
+    <w:nsid w:val="52E14B96"/>
     <w:multiLevelType w:val="hybridMultilevel"/>
-    <w:tmpl w:val="61E04F5A"/>
-    <w:lvl w:ilvl="0" w:tplc="BB9E2846" w:tentative="1">
+    <w:tmpl w:val="093C847C"/>
+    <w:lvl w:ilvl="0" w:tplc="FAD0A650">
       <w:start w:val="1"/>
       <w:numFmt w:val="bullet"/>
-      <w:lvlText w:val="●"/>
+      <w:lvlText w:val="•"/>
       <w:lvlJc w:val="left"/>
       <w:pPr>
-        <w:ind w:left="720" w:hanging="360"/>
+        <w:ind w:left="400" w:hanging="260"/>
       </w:pPr>
     </w:lvl>
-    <w:lvl w:ilvl="1" w:tplc="91D0629C" w:tentative="1">
+    <w:lvl w:ilvl="1" w:tplc="FC7A7C32" w:tentative="1">
       <w:start w:val="1"/>
       <w:numFmt w:val="bullet"/>
-      <w:lvlText w:val="○"/>
+      <w:lvlText w:val="–"/>
       <w:lvlJc w:val="left"/>
       <w:pPr>
-        <w:ind w:left="1440" w:hanging="360"/>
+        <w:ind w:left="760" w:hanging="260"/>
       </w:pPr>
     </w:lvl>
-    <w:lvl w:ilvl="2" w:tplc="83CA4FE8" w:tentative="1">
+    <w:lvl w:ilvl="2" w:tplc="2EFE28B2" w:tentative="1">
       <w:start w:val="1"/>
       <w:numFmt w:val="bullet"/>
-      <w:lvlText w:val="■"/>
+      <w:lvlText w:val="·"/>
       <w:lvlJc w:val="left"/>
       <w:pPr>
-        <w:ind w:left="2160" w:hanging="360"/>
+        <w:ind w:left="1120" w:hanging="260"/>
       </w:pPr>
     </w:lvl>
-    <w:lvl w:ilvl="3" w:tplc="EB20B318" w:tentative="1">
-      <w:start w:val="1"/>
-      <w:numFmt w:val="bullet"/>
-      <w:lvlText w:val="●"/>
-      <w:lvlJc w:val="left"/>
-      <w:pPr>
-        <w:ind w:left="2880" w:hanging="360"/>
-      </w:pPr>
-    </w:lvl>
-    <w:lvl w:ilvl="4" w:tplc="2028DFE8" w:tentative="1">
-      <w:start w:val="1"/>
-      <w:numFmt w:val="bullet"/>
-      <w:lvlText w:val="○"/>
-      <w:lvlJc w:val="left"/>
-      <w:pPr>
-        <w:ind w:left="3600" w:hanging="360"/>
-      </w:pPr>
-    </w:lvl>
-    <w:lvl w:ilvl="5" w:tplc="4B28908E" w:tentative="1">
-      <w:start w:val="1"/>
-      <w:numFmt w:val="bullet"/>
-      <w:lvlText w:val="■"/>
-      <w:lvlJc w:val="left"/>
-      <w:pPr>
-        <w:ind w:left="4320" w:hanging="360"/>
-      </w:pPr>
-    </w:lvl>
-    <w:lvl w:ilvl="6" w:tplc="14F8ADC2" w:tentative="1">
-      <w:start w:val="1"/>
-      <w:numFmt w:val="bullet"/>
-      <w:lvlText w:val="●"/>
-      <w:lvlJc w:val="left"/>
-      <w:pPr>
-        <w:ind w:left="5040" w:hanging="360"/>
-      </w:pPr>
-    </w:lvl>
-    <w:lvl w:ilvl="7" w:tplc="5E4AC994" w:tentative="1">
-      <w:start w:val="1"/>
-      <w:numFmt w:val="bullet"/>
-      <w:lvlText w:val="●"/>
-      <w:lvlJc w:val="left"/>
-      <w:pPr>
-        <w:ind w:left="5760" w:hanging="360"/>
-      </w:pPr>
-    </w:lvl>
-    <w:lvl w:ilvl="8" w:tplc="BBBCA338" w:tentative="1">
-      <w:start w:val="1"/>
-      <w:numFmt w:val="bullet"/>
-      <w:lvlText w:val="●"/>
-      <w:lvlJc w:val="left"/>
-      <w:pPr>
-        <w:ind w:left="6480" w:hanging="360"/>
-      </w:pPr>
-    </w:lvl>
-  </w:abstractNum>
-  <w:abstractNum w:abstractNumId="2" w15:restartNumberingAfterBreak="0">
-    <w:nsid w:val="44CF0349"/>
-    <w:multiLevelType w:val="hybridMultilevel"/>
-    <w:tmpl w:val="87788296"/>
-    <w:lvl w:ilvl="0" w:tplc="5B02C534">
-      <w:start w:val="1"/>
-      <w:numFmt w:val="decimal"/>
-      <w:lvlText w:val="%1."/>
-      <w:lvlJc w:val="left"/>
-      <w:pPr>
-        <w:ind w:left="420" w:hanging="300"/>
-      </w:pPr>
-    </w:lvl>
-    <w:lvl w:ilvl="1" w:tplc="0D8ADBA0">
+    <w:lvl w:ilvl="3" w:tplc="BDF0134E">
       <w:numFmt w:val="decimal"/>
       <w:lvlText w:val=""/>
       <w:lvlJc w:val="left"/>
     </w:lvl>
-    <w:lvl w:ilvl="2" w:tplc="379E29C2">
+    <w:lvl w:ilvl="4" w:tplc="1D8A79B2">
       <w:numFmt w:val="decimal"/>
       <w:lvlText w:val=""/>
       <w:lvlJc w:val="left"/>
     </w:lvl>
-    <w:lvl w:ilvl="3" w:tplc="47120264">
+    <w:lvl w:ilvl="5" w:tplc="3404E942">
       <w:numFmt w:val="decimal"/>
       <w:lvlText w:val=""/>
       <w:lvlJc w:val="left"/>
     </w:lvl>
-    <w:lvl w:ilvl="4" w:tplc="EFC4EEEE">
+    <w:lvl w:ilvl="6" w:tplc="13A01E72">
       <w:numFmt w:val="decimal"/>
       <w:lvlText w:val=""/>
       <w:lvlJc w:val="left"/>
     </w:lvl>
-    <w:lvl w:ilvl="5" w:tplc="C684288A">
+    <w:lvl w:ilvl="7" w:tplc="6978A60C">
       <w:numFmt w:val="decimal"/>
       <w:lvlText w:val=""/>
       <w:lvlJc w:val="left"/>
     </w:lvl>
-    <w:lvl w:ilvl="6" w:tplc="B8260C92">
-      <w:numFmt w:val="decimal"/>
-      <w:lvlText w:val=""/>
-      <w:lvlJc w:val="left"/>
-    </w:lvl>
-    <w:lvl w:ilvl="7" w:tplc="ADF41A50">
-      <w:numFmt w:val="decimal"/>
-      <w:lvlText w:val=""/>
-      <w:lvlJc w:val="left"/>
-    </w:lvl>
-    <w:lvl w:ilvl="8" w:tplc="D9ECDEA0">
+    <w:lvl w:ilvl="8" w:tplc="B9E2C0A2">
       <w:numFmt w:val="decimal"/>
       <w:lvlText w:val=""/>
       <w:lvlJc w:val="left"/>
     </w:lvl>
   </w:abstractNum>
-  <w:num w:numId="1" w16cid:durableId="1283614163">
-    <w:abstractNumId w:val="1"/>
-    <w:lvlOverride w:ilvl="0">
-      <w:startOverride w:val="1"/>
-    </w:lvlOverride>
-  </w:num>
-  <w:num w:numId="2" w16cid:durableId="472449273">
+  <w:abstractNum w:abstractNumId="2" w15:restartNumberingAfterBreak="0">
+    <w:nsid w:val="77D5098A"/>
+    <w:multiLevelType w:val="hybridMultilevel"/>
+    <w:tmpl w:val="724E8A0E"/>
+    <w:lvl w:ilvl="0" w:tplc="D1123E64" w:tentative="1">
+      <w:start w:val="1"/>
+      <w:numFmt w:val="bullet"/>
+      <w:lvlText w:val="●"/>
+      <w:lvlJc w:val="left"/>
+      <w:pPr>
+        <w:ind w:left="720" w:hanging="360"/>
+      </w:pPr>
+    </w:lvl>
+    <w:lvl w:ilvl="1" w:tplc="D47E9F28" w:tentative="1">
+      <w:start w:val="1"/>
+      <w:numFmt w:val="bullet"/>
+      <w:lvlText w:val="○"/>
+      <w:lvlJc w:val="left"/>
+      <w:pPr>
+        <w:ind w:left="1440" w:hanging="360"/>
+      </w:pPr>
+    </w:lvl>
+    <w:lvl w:ilvl="2" w:tplc="3B7A40C2" w:tentative="1">
+      <w:start w:val="1"/>
+      <w:numFmt w:val="bullet"/>
+      <w:lvlText w:val="■"/>
+      <w:lvlJc w:val="left"/>
+      <w:pPr>
+        <w:ind w:left="2160" w:hanging="360"/>
+      </w:pPr>
+    </w:lvl>
+    <w:lvl w:ilvl="3" w:tplc="D10E9596" w:tentative="1">
+      <w:start w:val="1"/>
+      <w:numFmt w:val="bullet"/>
+      <w:lvlText w:val="●"/>
+      <w:lvlJc w:val="left"/>
+      <w:pPr>
+        <w:ind w:left="2880" w:hanging="360"/>
+      </w:pPr>
+    </w:lvl>
+    <w:lvl w:ilvl="4" w:tplc="21A049D8" w:tentative="1">
+      <w:start w:val="1"/>
+      <w:numFmt w:val="bullet"/>
+      <w:lvlText w:val="○"/>
+      <w:lvlJc w:val="left"/>
+      <w:pPr>
+        <w:ind w:left="3600" w:hanging="360"/>
+      </w:pPr>
+    </w:lvl>
+    <w:lvl w:ilvl="5" w:tplc="6FB87A3A" w:tentative="1">
+      <w:start w:val="1"/>
+      <w:numFmt w:val="bullet"/>
+      <w:lvlText w:val="■"/>
+      <w:lvlJc w:val="left"/>
+      <w:pPr>
+        <w:ind w:left="4320" w:hanging="360"/>
+      </w:pPr>
+    </w:lvl>
+    <w:lvl w:ilvl="6" w:tplc="8166C000" w:tentative="1">
+      <w:start w:val="1"/>
+      <w:numFmt w:val="bullet"/>
+      <w:lvlText w:val="●"/>
+      <w:lvlJc w:val="left"/>
+      <w:pPr>
+        <w:ind w:left="5040" w:hanging="360"/>
+      </w:pPr>
+    </w:lvl>
+    <w:lvl w:ilvl="7" w:tplc="5912672A" w:tentative="1">
+      <w:start w:val="1"/>
+      <w:numFmt w:val="bullet"/>
+      <w:lvlText w:val="●"/>
+      <w:lvlJc w:val="left"/>
+      <w:pPr>
+        <w:ind w:left="5760" w:hanging="360"/>
+      </w:pPr>
+    </w:lvl>
+    <w:lvl w:ilvl="8" w:tplc="4DCAB810" w:tentative="1">
+      <w:start w:val="1"/>
+      <w:numFmt w:val="bullet"/>
+      <w:lvlText w:val="●"/>
+      <w:lvlJc w:val="left"/>
+      <w:pPr>
+        <w:ind w:left="6480" w:hanging="360"/>
+      </w:pPr>
+    </w:lvl>
+  </w:abstractNum>
+  <w:num w:numId="1" w16cid:durableId="1942494292">
     <w:abstractNumId w:val="2"/>
     <w:lvlOverride w:ilvl="0">
       <w:startOverride w:val="1"/>
     </w:lvlOverride>
   </w:num>
-  <w:num w:numId="3" w16cid:durableId="828711516">
+  <w:num w:numId="2" w16cid:durableId="967857037">
     <w:abstractNumId w:val="0"/>
+    <w:lvlOverride w:ilvl="0">
+      <w:startOverride w:val="1"/>
+    </w:lvlOverride>
+  </w:num>
+  <w:num w:numId="3" w16cid:durableId="712115132">
+    <w:abstractNumId w:val="1"/>
     <w:lvlOverride w:ilvl="0">
       <w:startOverride w:val="1"/>
     </w:lvlOverride>
@@ -4721,7 +4721,7 @@
     <w:autoRedefine/>
     <w:uiPriority w:val="39"/>
     <w:unhideWhenUsed/>
-    <w:rsid w:val="0077204B"/>
+    <w:rsid w:val="00A36C7E"/>
     <w:pPr>
       <w:spacing w:after="100"/>
     </w:pPr>

</xml_diff>

<commit_message>
Cambio de equipo: el chip del celular devuelto pasa al nuevo (SPEC 2.172)
</commit_message>
<xml_diff>
--- a/documentacion/Arquitectura_general.docx
+++ b/documentacion/Arquitectura_general.docx
@@ -448,7 +448,7 @@
     <w:sdt>
       <w:sdtPr>
         <w:alias w:val="Contenido"/>
-        <w:id w:val="2019728318"/>
+        <w:id w:val="-1026786184"/>
       </w:sdtPr>
       <w:sdtEndPr/>
       <w:sdtContent>
@@ -477,7 +477,7 @@
           <w:r>
             <w:fldChar w:fldCharType="separate"/>
           </w:r>
-          <w:hyperlink w:anchor="_Toc243305283" w:history="1">
+          <w:hyperlink w:anchor="_Toc243311729" w:history="1">
             <w:r>
               <w:rPr>
                 <w:rStyle w:val="Hipervnculo"/>
@@ -501,7 +501,7 @@
               <w:rPr>
                 <w:noProof/>
               </w:rPr>
-              <w:instrText xml:space="preserve"> PAGEREF _Toc243305283 \h </w:instrText>
+              <w:instrText xml:space="preserve"> PAGEREF _Toc243311729 \h </w:instrText>
             </w:r>
             <w:r>
               <w:rPr>
@@ -544,7 +544,7 @@
               <w14:ligatures w14:val="standardContextual"/>
             </w:rPr>
           </w:pPr>
-          <w:hyperlink w:anchor="_Toc243305284" w:history="1">
+          <w:hyperlink w:anchor="_Toc243311730" w:history="1">
             <w:r>
               <w:rPr>
                 <w:rStyle w:val="Hipervnculo"/>
@@ -568,7 +568,7 @@
               <w:rPr>
                 <w:noProof/>
               </w:rPr>
-              <w:instrText xml:space="preserve"> PAGEREF _Toc243305284 \h </w:instrText>
+              <w:instrText xml:space="preserve"> PAGEREF _Toc243311730 \h </w:instrText>
             </w:r>
             <w:r>
               <w:rPr>
@@ -611,7 +611,7 @@
               <w14:ligatures w14:val="standardContextual"/>
             </w:rPr>
           </w:pPr>
-          <w:hyperlink w:anchor="_Toc243305285" w:history="1">
+          <w:hyperlink w:anchor="_Toc243311731" w:history="1">
             <w:r>
               <w:rPr>
                 <w:rStyle w:val="Hipervnculo"/>
@@ -635,7 +635,7 @@
               <w:rPr>
                 <w:noProof/>
               </w:rPr>
-              <w:instrText xml:space="preserve"> PAGEREF _Toc243305285 \h </w:instrText>
+              <w:instrText xml:space="preserve"> PAGEREF _Toc243311731 \h </w:instrText>
             </w:r>
             <w:r>
               <w:rPr>
@@ -678,7 +678,7 @@
               <w14:ligatures w14:val="standardContextual"/>
             </w:rPr>
           </w:pPr>
-          <w:hyperlink w:anchor="_Toc243305286" w:history="1">
+          <w:hyperlink w:anchor="_Toc243311732" w:history="1">
             <w:r>
               <w:rPr>
                 <w:rStyle w:val="Hipervnculo"/>
@@ -702,7 +702,7 @@
               <w:rPr>
                 <w:noProof/>
               </w:rPr>
-              <w:instrText xml:space="preserve"> PAGEREF _Toc243305286 \h </w:instrText>
+              <w:instrText xml:space="preserve"> PAGEREF _Toc243311732 \h </w:instrText>
             </w:r>
             <w:r>
               <w:rPr>
@@ -745,7 +745,7 @@
               <w14:ligatures w14:val="standardContextual"/>
             </w:rPr>
           </w:pPr>
-          <w:hyperlink w:anchor="_Toc243305287" w:history="1">
+          <w:hyperlink w:anchor="_Toc243311733" w:history="1">
             <w:r>
               <w:rPr>
                 <w:rStyle w:val="Hipervnculo"/>
@@ -769,7 +769,7 @@
               <w:rPr>
                 <w:noProof/>
               </w:rPr>
-              <w:instrText xml:space="preserve"> PAGEREF _Toc243305287 \h </w:instrText>
+              <w:instrText xml:space="preserve"> PAGEREF _Toc243311733 \h </w:instrText>
             </w:r>
             <w:r>
               <w:rPr>
@@ -812,7 +812,7 @@
               <w14:ligatures w14:val="standardContextual"/>
             </w:rPr>
           </w:pPr>
-          <w:hyperlink w:anchor="_Toc243305288" w:history="1">
+          <w:hyperlink w:anchor="_Toc243311734" w:history="1">
             <w:r>
               <w:rPr>
                 <w:rStyle w:val="Hipervnculo"/>
@@ -836,7 +836,7 @@
               <w:rPr>
                 <w:noProof/>
               </w:rPr>
-              <w:instrText xml:space="preserve"> PAGEREF _Toc243305288 \h </w:instrText>
+              <w:instrText xml:space="preserve"> PAGEREF _Toc243311734 \h </w:instrText>
             </w:r>
             <w:r>
               <w:rPr>
@@ -880,7 +880,7 @@
         <w:pStyle w:val="Ttulo1"/>
         <w:keepNext/>
       </w:pPr>
-      <w:bookmarkStart w:id="0" w:name="_Toc243305283"/>
+      <w:bookmarkStart w:id="0" w:name="_Toc243311729"/>
       <w:r>
         <w:t>1. Visión general</w:t>
       </w:r>
@@ -927,7 +927,7 @@
         <w:pStyle w:val="Ttulo1"/>
         <w:keepNext/>
       </w:pPr>
-      <w:bookmarkStart w:id="1" w:name="_Toc243305284"/>
+      <w:bookmarkStart w:id="1" w:name="_Toc243311730"/>
       <w:r>
         <w:t>2. Capas</w:t>
       </w:r>
@@ -1797,7 +1797,7 @@
         <w:pStyle w:val="Ttulo1"/>
         <w:keepNext/>
       </w:pPr>
-      <w:bookmarkStart w:id="2" w:name="_Toc243305285"/>
+      <w:bookmarkStart w:id="2" w:name="_Toc243311731"/>
       <w:r>
         <w:t>3. Flujo de una petición</w:t>
       </w:r>
@@ -2153,7 +2153,7 @@
         <w:pStyle w:val="Ttulo1"/>
         <w:keepNext/>
       </w:pPr>
-      <w:bookmarkStart w:id="3" w:name="_Toc243305286"/>
+      <w:bookmarkStart w:id="3" w:name="_Toc243311732"/>
       <w:r>
         <w:t>4. Módulos de dominio</w:t>
       </w:r>
@@ -3062,7 +3062,7 @@
         <w:pStyle w:val="Ttulo1"/>
         <w:keepNext/>
       </w:pPr>
-      <w:bookmarkStart w:id="4" w:name="_Toc243305287"/>
+      <w:bookmarkStart w:id="4" w:name="_Toc243311733"/>
       <w:r>
         <w:t>5. Despliegue</w:t>
       </w:r>
@@ -3213,7 +3213,7 @@
         <w:pStyle w:val="Ttulo1"/>
         <w:keepNext/>
       </w:pPr>
-      <w:bookmarkStart w:id="5" w:name="_Toc243305288"/>
+      <w:bookmarkStart w:id="5" w:name="_Toc243311734"/>
       <w:r>
         <w:t>6. Atributos de calidad que guían la arquitectura</w:t>
       </w:r>
@@ -3865,126 +3865,126 @@
 <file path=word/numbering.xml><?xml version="1.0" encoding="utf-8"?>
 <w:numbering xmlns:wpc="http://schemas.microsoft.com/office/word/2010/wordprocessingCanvas" xmlns:cx="http://schemas.microsoft.com/office/drawing/2014/chartex" xmlns:cx1="http://schemas.microsoft.com/office/drawing/2015/9/8/chartex" xmlns:cx2="http://schemas.microsoft.com/office/drawing/2015/10/21/chartex" xmlns:cx3="http://schemas.microsoft.com/office/drawing/2016/5/9/chartex" xmlns:cx4="http://schemas.microsoft.com/office/drawing/2016/5/10/chartex" xmlns:cx5="http://schemas.microsoft.com/office/drawing/2016/5/11/chartex" xmlns:cx6="http://schemas.microsoft.com/office/drawing/2016/5/12/chartex" xmlns:cx7="http://schemas.microsoft.com/office/drawing/2016/5/13/chartex" xmlns:cx8="http://schemas.microsoft.com/office/drawing/2016/5/14/chartex" xmlns:mc="http://schemas.openxmlformats.org/markup-compatibility/2006" xmlns:aink="http://schemas.microsoft.com/office/drawing/2016/ink" xmlns:am3d="http://schemas.microsoft.com/office/drawing/2017/model3d" xmlns:o="urn:schemas-microsoft-com:office:office" xmlns:oel="http://schemas.microsoft.com/office/2019/extlst" xmlns:r="http://schemas.openxmlformats.org/officeDocument/2006/relationships" xmlns:m="http://schemas.openxmlformats.org/officeDocument/2006/math" xmlns:v="urn:schemas-microsoft-com:vml" xmlns:wp14="http://schemas.microsoft.com/office/word/2010/wordprocessingDrawing" xmlns:wp="http://schemas.openxmlformats.org/drawingml/2006/wordprocessingDrawing" xmlns:w10="urn:schemas-microsoft-com:office:word" xmlns:w="http://schemas.openxmlformats.org/wordprocessingml/2006/main" xmlns:w14="http://schemas.microsoft.com/office/word/2010/wordml" xmlns:w15="http://schemas.microsoft.com/office/word/2012/wordml" xmlns:w16cex="http://schemas.microsoft.com/office/word/2018/wordml/cex" xmlns:w16cid="http://schemas.microsoft.com/office/word/2016/wordml/cid" xmlns:w16="http://schemas.microsoft.com/office/word/2018/wordml" xmlns:w16du="http://schemas.microsoft.com/office/word/2023/wordml/word16du" xmlns:w16sdtdh="http://schemas.microsoft.com/office/word/2020/wordml/sdtdatahash" xmlns:w16sdtfl="http://schemas.microsoft.com/office/word/2024/wordml/sdtformatlock" xmlns:w16se="http://schemas.microsoft.com/office/word/2015/wordml/symex" xmlns:wpg="http://schemas.microsoft.com/office/word/2010/wordprocessingGroup" xmlns:wpi="http://schemas.microsoft.com/office/word/2010/wordprocessingInk" xmlns:wne="http://schemas.microsoft.com/office/word/2006/wordml" xmlns:wps="http://schemas.microsoft.com/office/word/2010/wordprocessingShape" mc:Ignorable="w14 w15 w16se w16cid w16 w16cex w16sdtdh w16sdtfl w16du wp14">
   <w:abstractNum w:abstractNumId="0" w15:restartNumberingAfterBreak="0">
-    <w:nsid w:val="0E1273CC"/>
+    <w:nsid w:val="23F36AA5"/>
     <w:multiLevelType w:val="hybridMultilevel"/>
-    <w:tmpl w:val="493CF496"/>
-    <w:lvl w:ilvl="0" w:tplc="C1D0F5B2">
+    <w:tmpl w:val="2C763884"/>
+    <w:lvl w:ilvl="0" w:tplc="86668EB8">
       <w:start w:val="1"/>
-      <w:numFmt w:val="decimal"/>
-      <w:lvlText w:val="%1."/>
+      <w:numFmt w:val="bullet"/>
+      <w:lvlText w:val="•"/>
       <w:lvlJc w:val="left"/>
       <w:pPr>
-        <w:ind w:left="420" w:hanging="300"/>
+        <w:ind w:left="400" w:hanging="260"/>
       </w:pPr>
     </w:lvl>
-    <w:lvl w:ilvl="1" w:tplc="3BB29484">
+    <w:lvl w:ilvl="1" w:tplc="9EEE8EFA" w:tentative="1">
+      <w:start w:val="1"/>
+      <w:numFmt w:val="bullet"/>
+      <w:lvlText w:val="–"/>
+      <w:lvlJc w:val="left"/>
+      <w:pPr>
+        <w:ind w:left="760" w:hanging="260"/>
+      </w:pPr>
+    </w:lvl>
+    <w:lvl w:ilvl="2" w:tplc="792C0782" w:tentative="1">
+      <w:start w:val="1"/>
+      <w:numFmt w:val="bullet"/>
+      <w:lvlText w:val="·"/>
+      <w:lvlJc w:val="left"/>
+      <w:pPr>
+        <w:ind w:left="1120" w:hanging="260"/>
+      </w:pPr>
+    </w:lvl>
+    <w:lvl w:ilvl="3" w:tplc="46DA7E06">
       <w:numFmt w:val="decimal"/>
       <w:lvlText w:val=""/>
       <w:lvlJc w:val="left"/>
     </w:lvl>
-    <w:lvl w:ilvl="2" w:tplc="1B028820">
+    <w:lvl w:ilvl="4" w:tplc="1D6E563E">
       <w:numFmt w:val="decimal"/>
       <w:lvlText w:val=""/>
       <w:lvlJc w:val="left"/>
     </w:lvl>
-    <w:lvl w:ilvl="3" w:tplc="A9AE0EB8">
+    <w:lvl w:ilvl="5" w:tplc="DAB02776">
       <w:numFmt w:val="decimal"/>
       <w:lvlText w:val=""/>
       <w:lvlJc w:val="left"/>
     </w:lvl>
-    <w:lvl w:ilvl="4" w:tplc="1DF6E282">
+    <w:lvl w:ilvl="6" w:tplc="283849A2">
       <w:numFmt w:val="decimal"/>
       <w:lvlText w:val=""/>
       <w:lvlJc w:val="left"/>
     </w:lvl>
-    <w:lvl w:ilvl="5" w:tplc="2DD4A86C">
+    <w:lvl w:ilvl="7" w:tplc="27AEC49A">
       <w:numFmt w:val="decimal"/>
       <w:lvlText w:val=""/>
       <w:lvlJc w:val="left"/>
     </w:lvl>
-    <w:lvl w:ilvl="6" w:tplc="CCA445D6">
-      <w:numFmt w:val="decimal"/>
-      <w:lvlText w:val=""/>
-      <w:lvlJc w:val="left"/>
-    </w:lvl>
-    <w:lvl w:ilvl="7" w:tplc="8B50E61A">
-      <w:numFmt w:val="decimal"/>
-      <w:lvlText w:val=""/>
-      <w:lvlJc w:val="left"/>
-    </w:lvl>
-    <w:lvl w:ilvl="8" w:tplc="3A84316A">
+    <w:lvl w:ilvl="8" w:tplc="C8DC492C">
       <w:numFmt w:val="decimal"/>
       <w:lvlText w:val=""/>
       <w:lvlJc w:val="left"/>
     </w:lvl>
   </w:abstractNum>
   <w:abstractNum w:abstractNumId="1" w15:restartNumberingAfterBreak="0">
-    <w:nsid w:val="52E14B96"/>
+    <w:nsid w:val="4DFF6F45"/>
     <w:multiLevelType w:val="hybridMultilevel"/>
-    <w:tmpl w:val="093C847C"/>
-    <w:lvl w:ilvl="0" w:tplc="FAD0A650">
+    <w:tmpl w:val="01D24CB8"/>
+    <w:lvl w:ilvl="0" w:tplc="7E82B202">
       <w:start w:val="1"/>
-      <w:numFmt w:val="bullet"/>
-      <w:lvlText w:val="•"/>
+      <w:numFmt w:val="decimal"/>
+      <w:lvlText w:val="%1."/>
       <w:lvlJc w:val="left"/>
       <w:pPr>
-        <w:ind w:left="400" w:hanging="260"/>
+        <w:ind w:left="420" w:hanging="300"/>
       </w:pPr>
     </w:lvl>
-    <w:lvl w:ilvl="1" w:tplc="FC7A7C32" w:tentative="1">
-      <w:start w:val="1"/>
-      <w:numFmt w:val="bullet"/>
-      <w:lvlText w:val="–"/>
-      <w:lvlJc w:val="left"/>
-      <w:pPr>
-        <w:ind w:left="760" w:hanging="260"/>
-      </w:pPr>
-    </w:lvl>
-    <w:lvl w:ilvl="2" w:tplc="2EFE28B2" w:tentative="1">
-      <w:start w:val="1"/>
-      <w:numFmt w:val="bullet"/>
-      <w:lvlText w:val="·"/>
-      <w:lvlJc w:val="left"/>
-      <w:pPr>
-        <w:ind w:left="1120" w:hanging="260"/>
-      </w:pPr>
-    </w:lvl>
-    <w:lvl w:ilvl="3" w:tplc="BDF0134E">
+    <w:lvl w:ilvl="1" w:tplc="7A02FA4C">
       <w:numFmt w:val="decimal"/>
       <w:lvlText w:val=""/>
       <w:lvlJc w:val="left"/>
     </w:lvl>
-    <w:lvl w:ilvl="4" w:tplc="1D8A79B2">
+    <w:lvl w:ilvl="2" w:tplc="BB4611BA">
       <w:numFmt w:val="decimal"/>
       <w:lvlText w:val=""/>
       <w:lvlJc w:val="left"/>
     </w:lvl>
-    <w:lvl w:ilvl="5" w:tplc="3404E942">
+    <w:lvl w:ilvl="3" w:tplc="786C6202">
       <w:numFmt w:val="decimal"/>
       <w:lvlText w:val=""/>
       <w:lvlJc w:val="left"/>
     </w:lvl>
-    <w:lvl w:ilvl="6" w:tplc="13A01E72">
+    <w:lvl w:ilvl="4" w:tplc="73285B28">
       <w:numFmt w:val="decimal"/>
       <w:lvlText w:val=""/>
       <w:lvlJc w:val="left"/>
     </w:lvl>
-    <w:lvl w:ilvl="7" w:tplc="6978A60C">
+    <w:lvl w:ilvl="5" w:tplc="70F2917C">
       <w:numFmt w:val="decimal"/>
       <w:lvlText w:val=""/>
       <w:lvlJc w:val="left"/>
     </w:lvl>
-    <w:lvl w:ilvl="8" w:tplc="B9E2C0A2">
+    <w:lvl w:ilvl="6" w:tplc="A90C9BB0">
+      <w:numFmt w:val="decimal"/>
+      <w:lvlText w:val=""/>
+      <w:lvlJc w:val="left"/>
+    </w:lvl>
+    <w:lvl w:ilvl="7" w:tplc="496656BC">
+      <w:numFmt w:val="decimal"/>
+      <w:lvlText w:val=""/>
+      <w:lvlJc w:val="left"/>
+    </w:lvl>
+    <w:lvl w:ilvl="8" w:tplc="FFDAF326">
       <w:numFmt w:val="decimal"/>
       <w:lvlText w:val=""/>
       <w:lvlJc w:val="left"/>
     </w:lvl>
   </w:abstractNum>
   <w:abstractNum w:abstractNumId="2" w15:restartNumberingAfterBreak="0">
-    <w:nsid w:val="77D5098A"/>
+    <w:nsid w:val="5C125CB4"/>
     <w:multiLevelType w:val="hybridMultilevel"/>
-    <w:tmpl w:val="724E8A0E"/>
-    <w:lvl w:ilvl="0" w:tplc="D1123E64" w:tentative="1">
+    <w:tmpl w:val="45EE4334"/>
+    <w:lvl w:ilvl="0" w:tplc="9BFC99C0" w:tentative="1">
       <w:start w:val="1"/>
       <w:numFmt w:val="bullet"/>
       <w:lvlText w:val="●"/>
@@ -3993,7 +3993,7 @@
         <w:ind w:left="720" w:hanging="360"/>
       </w:pPr>
     </w:lvl>
-    <w:lvl w:ilvl="1" w:tplc="D47E9F28" w:tentative="1">
+    <w:lvl w:ilvl="1" w:tplc="ECFE6A86" w:tentative="1">
       <w:start w:val="1"/>
       <w:numFmt w:val="bullet"/>
       <w:lvlText w:val="○"/>
@@ -4002,7 +4002,7 @@
         <w:ind w:left="1440" w:hanging="360"/>
       </w:pPr>
     </w:lvl>
-    <w:lvl w:ilvl="2" w:tplc="3B7A40C2" w:tentative="1">
+    <w:lvl w:ilvl="2" w:tplc="36BC55A8" w:tentative="1">
       <w:start w:val="1"/>
       <w:numFmt w:val="bullet"/>
       <w:lvlText w:val="■"/>
@@ -4011,7 +4011,7 @@
         <w:ind w:left="2160" w:hanging="360"/>
       </w:pPr>
     </w:lvl>
-    <w:lvl w:ilvl="3" w:tplc="D10E9596" w:tentative="1">
+    <w:lvl w:ilvl="3" w:tplc="7D64F4A2" w:tentative="1">
       <w:start w:val="1"/>
       <w:numFmt w:val="bullet"/>
       <w:lvlText w:val="●"/>
@@ -4020,7 +4020,7 @@
         <w:ind w:left="2880" w:hanging="360"/>
       </w:pPr>
     </w:lvl>
-    <w:lvl w:ilvl="4" w:tplc="21A049D8" w:tentative="1">
+    <w:lvl w:ilvl="4" w:tplc="96D2731A" w:tentative="1">
       <w:start w:val="1"/>
       <w:numFmt w:val="bullet"/>
       <w:lvlText w:val="○"/>
@@ -4029,7 +4029,7 @@
         <w:ind w:left="3600" w:hanging="360"/>
       </w:pPr>
     </w:lvl>
-    <w:lvl w:ilvl="5" w:tplc="6FB87A3A" w:tentative="1">
+    <w:lvl w:ilvl="5" w:tplc="50543594" w:tentative="1">
       <w:start w:val="1"/>
       <w:numFmt w:val="bullet"/>
       <w:lvlText w:val="■"/>
@@ -4038,7 +4038,7 @@
         <w:ind w:left="4320" w:hanging="360"/>
       </w:pPr>
     </w:lvl>
-    <w:lvl w:ilvl="6" w:tplc="8166C000" w:tentative="1">
+    <w:lvl w:ilvl="6" w:tplc="CF162880" w:tentative="1">
       <w:start w:val="1"/>
       <w:numFmt w:val="bullet"/>
       <w:lvlText w:val="●"/>
@@ -4047,7 +4047,7 @@
         <w:ind w:left="5040" w:hanging="360"/>
       </w:pPr>
     </w:lvl>
-    <w:lvl w:ilvl="7" w:tplc="5912672A" w:tentative="1">
+    <w:lvl w:ilvl="7" w:tplc="41FCD332" w:tentative="1">
       <w:start w:val="1"/>
       <w:numFmt w:val="bullet"/>
       <w:lvlText w:val="●"/>
@@ -4056,7 +4056,7 @@
         <w:ind w:left="5760" w:hanging="360"/>
       </w:pPr>
     </w:lvl>
-    <w:lvl w:ilvl="8" w:tplc="4DCAB810" w:tentative="1">
+    <w:lvl w:ilvl="8" w:tplc="A5E8229E" w:tentative="1">
       <w:start w:val="1"/>
       <w:numFmt w:val="bullet"/>
       <w:lvlText w:val="●"/>
@@ -4066,20 +4066,20 @@
       </w:pPr>
     </w:lvl>
   </w:abstractNum>
-  <w:num w:numId="1" w16cid:durableId="1942494292">
+  <w:num w:numId="1" w16cid:durableId="1414426028">
     <w:abstractNumId w:val="2"/>
     <w:lvlOverride w:ilvl="0">
       <w:startOverride w:val="1"/>
     </w:lvlOverride>
   </w:num>
-  <w:num w:numId="2" w16cid:durableId="967857037">
-    <w:abstractNumId w:val="0"/>
+  <w:num w:numId="2" w16cid:durableId="670303769">
+    <w:abstractNumId w:val="1"/>
     <w:lvlOverride w:ilvl="0">
       <w:startOverride w:val="1"/>
     </w:lvlOverride>
   </w:num>
-  <w:num w:numId="3" w16cid:durableId="712115132">
-    <w:abstractNumId w:val="1"/>
+  <w:num w:numId="3" w16cid:durableId="880942479">
+    <w:abstractNumId w:val="0"/>
     <w:lvlOverride w:ilvl="0">
       <w:startOverride w:val="1"/>
     </w:lvlOverride>
@@ -4721,7 +4721,7 @@
     <w:autoRedefine/>
     <w:uiPriority w:val="39"/>
     <w:unhideWhenUsed/>
-    <w:rsid w:val="00A36C7E"/>
+    <w:rsid w:val="009F32B4"/>
     <w:pPr>
       <w:spacing w:after="100"/>
     </w:pPr>

</xml_diff>